<commit_message>
Filter investor-database pages, format email drafts, dashboard polish, updated Components Map
Co-Authored-By: Claude Opus 5.5 <noreply@anthropic.com>
</commit_message>
<xml_diff>
--- a/docs/VC_Pipeline_Intelligence_Components_Map.docx
+++ b/docs/VC_Pipeline_Intelligence_Components_Map.docx
@@ -188,7 +188,7 @@
             <w:pPr>
               <w:spacing w:after="30"/>
             </w:pPr>
-            <w:hyperlink w:history="1" r:id="rIdzjprpsmlgb1lcnenfalf3">
+            <w:hyperlink w:history="1" r:id="rIdkwd9t3fkxukqt_fddhwwd">
               <w:r>
                 <w:rPr>
                   <w:rStyle w:val="Hyperlink"/>
@@ -323,7 +323,7 @@
             <w:pPr>
               <w:spacing w:after="30"/>
             </w:pPr>
-            <w:hyperlink w:history="1" r:id="rId5ctqv8fr7qmob5ccevnlc">
+            <w:hyperlink w:history="1" r:id="rIdspl_sqykng0wjzwqxqs3w">
               <w:r>
                 <w:rPr>
                   <w:rStyle w:val="Hyperlink"/>
@@ -4346,7 +4346,7 @@
           <w:sz w:val="21"/>
           <w:szCs w:val="21"/>
         </w:rPr>
-        <w:t xml:space="preserve">Latest run: 11 Oct 2026, 19:49 IST (manual, on Vercel). 50 VCs checked, 274 validated signals from the last 30 days, completed in 3 min 27 s. Vikram's columns: untouched (fingerprints match).</w:t>
+        <w:t xml:space="preserve">Latest run: 11 Oct 2026, 20:16 IST (manual). 50 VCs checked, 278 validated signals from the last 30 days, completed in 3 min 24 s. Vikram's columns: untouched (fingerprints match).</w:t>
       </w:r>
     </w:p>
     <w:tbl>
@@ -4499,7 +4499,7 @@
                 <w:sz w:val="19"/>
                 <w:szCs w:val="19"/>
               </w:rPr>
-              <w:t xml:space="preserve">21</w:t>
+              <w:t xml:space="preserve">22</w:t>
             </w:r>
           </w:p>
         </w:tc>
@@ -4829,7 +4829,7 @@
                 <w:sz w:val="19"/>
                 <w:szCs w:val="19"/>
               </w:rPr>
-              <w:t xml:space="preserve">2</w:t>
+              <w:t xml:space="preserve">1</w:t>
             </w:r>
           </w:p>
         </w:tc>
@@ -5040,7 +5040,7 @@
                 <w:sz w:val="19"/>
                 <w:szCs w:val="19"/>
               </w:rPr>
-              <w:t xml:space="preserve">Steve Sarracino, Activant Capital</w:t>
+              <w:t xml:space="preserve">Santosh Sankar, Dynamo Ventures</w:t>
             </w:r>
           </w:p>
         </w:tc>
@@ -5072,7 +5072,7 @@
                 <w:sz w:val="19"/>
                 <w:szCs w:val="19"/>
               </w:rPr>
-              <w:t xml:space="preserve">61</w:t>
+              <w:t xml:space="preserve">78</w:t>
             </w:r>
           </w:p>
         </w:tc>
@@ -5104,7 +5104,7 @@
                 <w:sz w:val="19"/>
                 <w:szCs w:val="19"/>
               </w:rPr>
-              <w:t xml:space="preserve">Nudge now</w:t>
+              <w:t xml:space="preserve">Reach out now</w:t>
             </w:r>
           </w:p>
         </w:tc>
@@ -5136,7 +5136,7 @@
                 <w:sz w:val="19"/>
                 <w:szCs w:val="19"/>
               </w:rPr>
-              <w:t xml:space="preserve">10-01: Settle secures a $240M credit facility. 10-06: Activant blog on legal AI and C.H.BECK's stake in Noxtua. [firm]</w:t>
+              <w:t xml:space="preserve">28 Sep and 21 Sep: Dynamo's weekly newsletter on supply chain and logistics ecosystem news and venture deals.</w:t>
             </w:r>
           </w:p>
         </w:tc>
@@ -5170,7 +5170,7 @@
                 <w:sz w:val="19"/>
                 <w:szCs w:val="19"/>
               </w:rPr>
-              <w:t xml:space="preserve">Shailendra Singh, Peak XV Partners</w:t>
+              <w:t xml:space="preserve">Mukul Arora, Elevation Capital</w:t>
             </w:r>
           </w:p>
         </w:tc>
@@ -5202,7 +5202,7 @@
                 <w:sz w:val="19"/>
                 <w:szCs w:val="19"/>
               </w:rPr>
-              <w:t xml:space="preserve">54</w:t>
+              <w:t xml:space="preserve">58</w:t>
             </w:r>
           </w:p>
         </w:tc>
@@ -5266,7 +5266,7 @@
                 <w:sz w:val="19"/>
                 <w:szCs w:val="19"/>
               </w:rPr>
-              <w:t xml:space="preserve">10-11: Peak XV-backed supply chain platform Zetwerk set to IPO on 15 Oct. 10-08: Plum raised Rs 193 crore led by Peak XV. [firm]</w:t>
+              <w:t xml:space="preserve">28 Sep: led Dextr AI's $6.7M seed. 22 Sep: blog on Indian AI agents paired with on-ground fulfilment.</w:t>
             </w:r>
           </w:p>
         </w:tc>
@@ -5300,7 +5300,7 @@
                 <w:sz w:val="19"/>
                 <w:szCs w:val="19"/>
               </w:rPr>
-              <w:t xml:space="preserve">Mukul Arora, Elevation Capital</w:t>
+              <w:t xml:space="preserve">Shailendra Singh, Peak XV Partners</w:t>
             </w:r>
           </w:p>
         </w:tc>
@@ -5332,7 +5332,7 @@
                 <w:sz w:val="19"/>
                 <w:szCs w:val="19"/>
               </w:rPr>
-              <w:t xml:space="preserve">53</w:t>
+              <w:t xml:space="preserve">55</w:t>
             </w:r>
           </w:p>
         </w:tc>
@@ -5396,7 +5396,7 @@
                 <w:sz w:val="19"/>
                 <w:szCs w:val="19"/>
               </w:rPr>
-              <w:t xml:space="preserve">10-07: Elevation blog on the AI recruitment market. 09-28: led Dextr AI's $6.7M seed. [firm]</w:t>
+              <w:t xml:space="preserve">11 Oct: Peak XV-backed B2B manufacturing and supply chain platform Zetwerk launches its IPO on 15 Oct.</w:t>
             </w:r>
           </w:p>
         </w:tc>
@@ -5430,7 +5430,7 @@
                 <w:sz w:val="19"/>
                 <w:szCs w:val="19"/>
               </w:rPr>
-              <w:t xml:space="preserve">Rachel Holt, Construct Capital</w:t>
+              <w:t xml:space="preserve">Joe Lonsdale, 8VC</w:t>
             </w:r>
           </w:p>
         </w:tc>
@@ -5462,7 +5462,7 @@
                 <w:sz w:val="19"/>
                 <w:szCs w:val="19"/>
               </w:rPr>
-              <w:t xml:space="preserve">45</w:t>
+              <w:t xml:space="preserve">52</w:t>
             </w:r>
           </w:p>
         </w:tc>
@@ -5494,7 +5494,7 @@
                 <w:sz w:val="19"/>
                 <w:szCs w:val="19"/>
               </w:rPr>
-              <w:t xml:space="preserve">Reach out now</w:t>
+              <w:t xml:space="preserve">Nudge now</w:t>
             </w:r>
           </w:p>
         </w:tc>
@@ -5526,7 +5526,7 @@
                 <w:sz w:val="19"/>
                 <w:szCs w:val="19"/>
               </w:rPr>
-              <w:t xml:space="preserve">10-08: Polygrade emerges with $6.3M. 09-17: BackOps raises $42M Series B for AI supply chain automation. [firm]</w:t>
+              <w:t xml:space="preserve">9 Oct: Gallatin AI raised a $50M Series A for its military logistics platform.</w:t>
             </w:r>
           </w:p>
         </w:tc>
@@ -5560,7 +5560,7 @@
                 <w:sz w:val="19"/>
                 <w:szCs w:val="19"/>
               </w:rPr>
-              <w:t xml:space="preserve">Joe Lonsdale, 8VC</w:t>
+              <w:t xml:space="preserve">Kunal Bahl, Titan Capital</w:t>
             </w:r>
           </w:p>
         </w:tc>
@@ -5592,7 +5592,7 @@
                 <w:sz w:val="19"/>
                 <w:szCs w:val="19"/>
               </w:rPr>
-              <w:t xml:space="preserve">44</w:t>
+              <w:t xml:space="preserve">40</w:t>
             </w:r>
           </w:p>
         </w:tc>
@@ -5656,7 +5656,7 @@
                 <w:sz w:val="19"/>
                 <w:szCs w:val="19"/>
               </w:rPr>
-              <w:t xml:space="preserve">10-09: Gallatin AI raised $50M Series A for its military logistics platform. [firm]</w:t>
+              <w:t xml:space="preserve">30 Sep: portfolio company Blitz (quick-commerce fulfilment) raises at a higher valuation.</w:t>
             </w:r>
           </w:p>
         </w:tc>
@@ -5690,7 +5690,7 @@
                 <w:sz w:val="19"/>
                 <w:szCs w:val="19"/>
               </w:rPr>
-              <w:t xml:space="preserve">Kunal Bahl, Titan Capital</w:t>
+              <w:t xml:space="preserve">Anand Lunia, India Quotient</w:t>
             </w:r>
           </w:p>
         </w:tc>
@@ -5786,7 +5786,7 @@
                 <w:sz w:val="19"/>
                 <w:szCs w:val="19"/>
               </w:rPr>
-              <w:t xml:space="preserve">09-30: quick-commerce fulfilment startup Blitz starts pre-Series B. 10-09: Kunal Bahl interview on setbacks.</w:t>
+              <w:t xml:space="preserve">30 Sep: portfolio company Blitz (quick-commerce fulfilment) kicks off its pre-Series B.</w:t>
             </w:r>
           </w:p>
         </w:tc>
@@ -5820,7 +5820,7 @@
                 <w:sz w:val="19"/>
                 <w:szCs w:val="19"/>
               </w:rPr>
-              <w:t xml:space="preserve">Anand Lunia, India Quotient</w:t>
+              <w:t xml:space="preserve">Shripati Acharya, Prime Venture Partners</w:t>
             </w:r>
           </w:p>
         </w:tc>
@@ -5852,7 +5852,7 @@
                 <w:sz w:val="19"/>
                 <w:szCs w:val="19"/>
               </w:rPr>
-              <w:t xml:space="preserve">39</w:t>
+              <w:t xml:space="preserve">35</w:t>
             </w:r>
           </w:p>
         </w:tc>
@@ -5916,7 +5916,7 @@
                 <w:sz w:val="19"/>
                 <w:szCs w:val="19"/>
               </w:rPr>
-              <w:t xml:space="preserve">09-30: portfolio company Blitz (quick-commerce fulfilment) kicks off pre-Series B. [firm]</w:t>
+              <w:t xml:space="preserve">8 Oct: led Desible.ai's Rs 32 crore seed round (B2B AI for BFSI).</w:t>
             </w:r>
           </w:p>
         </w:tc>
@@ -5950,7 +5950,7 @@
                 <w:sz w:val="19"/>
                 <w:szCs w:val="19"/>
               </w:rPr>
-              <w:t xml:space="preserve">Pranav Pai, 3one4 Capital</w:t>
+              <w:t xml:space="preserve">Steve Sarracino, Activant Capital</w:t>
             </w:r>
           </w:p>
         </w:tc>
@@ -5982,7 +5982,7 @@
                 <w:sz w:val="19"/>
                 <w:szCs w:val="19"/>
               </w:rPr>
-              <w:t xml:space="preserve">35</w:t>
+              <w:t xml:space="preserve">33</w:t>
             </w:r>
           </w:p>
         </w:tc>
@@ -6014,7 +6014,7 @@
                 <w:sz w:val="19"/>
                 <w:szCs w:val="19"/>
               </w:rPr>
-              <w:t xml:space="preserve">Reach out now</w:t>
+              <w:t xml:space="preserve">Nudge now</w:t>
             </w:r>
           </w:p>
         </w:tc>
@@ -6046,137 +6046,7 @@
                 <w:sz w:val="19"/>
                 <w:szCs w:val="19"/>
               </w:rPr>
-              <w:t xml:space="preserve">09-28: exited EV mobility startup Yulu in its $93M Series C. 10-03: co-led Gravity's $15M round. [firm]</w:t>
-            </w:r>
-          </w:p>
-        </w:tc>
-      </w:tr>
-      <w:tr>
-        <w:tc>
-          <w:tcPr>
-            <w:tcW w:type="dxa" w:w="2382"/>
-            <w:tcBorders>
-              <w:top w:val="single" w:color="C9D1DE" w:sz="4"/>
-              <w:left w:val="single" w:color="C9D1DE" w:sz="4"/>
-              <w:bottom w:val="single" w:color="C9D1DE" w:sz="4"/>
-              <w:right w:val="single" w:color="C9D1DE" w:sz="4"/>
-            </w:tcBorders>
-            <w:tcMar>
-              <w:top w:type="dxa" w:w="70"/>
-              <w:left w:type="dxa" w:w="100"/>
-              <w:bottom w:type="dxa" w:w="70"/>
-              <w:right w:type="dxa" w:w="100"/>
-            </w:tcMar>
-          </w:tcPr>
-          <w:p>
-            <w:pPr>
-              <w:spacing w:after="30"/>
-            </w:pPr>
-            <w:r>
-              <w:rPr>
-                <w:rFonts w:ascii="Calibri" w:cs="Calibri" w:eastAsia="Calibri" w:hAnsi="Calibri"/>
-                <w:b w:val="false"/>
-                <w:bCs w:val="false"/>
-                <w:sz w:val="19"/>
-                <w:szCs w:val="19"/>
-              </w:rPr>
-              <w:t xml:space="preserve">Shripati Acharya, Prime Venture Partners</w:t>
-            </w:r>
-          </w:p>
-        </w:tc>
-        <w:tc>
-          <w:tcPr>
-            <w:tcW w:type="dxa" w:w="758"/>
-            <w:tcBorders>
-              <w:top w:val="single" w:color="C9D1DE" w:sz="4"/>
-              <w:left w:val="single" w:color="C9D1DE" w:sz="4"/>
-              <w:bottom w:val="single" w:color="C9D1DE" w:sz="4"/>
-              <w:right w:val="single" w:color="C9D1DE" w:sz="4"/>
-            </w:tcBorders>
-            <w:tcMar>
-              <w:top w:type="dxa" w:w="70"/>
-              <w:left w:type="dxa" w:w="100"/>
-              <w:bottom w:type="dxa" w:w="70"/>
-              <w:right w:type="dxa" w:w="100"/>
-            </w:tcMar>
-          </w:tcPr>
-          <w:p>
-            <w:pPr>
-              <w:spacing w:after="30"/>
-            </w:pPr>
-            <w:r>
-              <w:rPr>
-                <w:rFonts w:ascii="Calibri" w:cs="Calibri" w:eastAsia="Calibri" w:hAnsi="Calibri"/>
-                <w:b w:val="false"/>
-                <w:bCs w:val="false"/>
-                <w:sz w:val="19"/>
-                <w:szCs w:val="19"/>
-              </w:rPr>
-              <w:t xml:space="preserve">35</w:t>
-            </w:r>
-          </w:p>
-        </w:tc>
-        <w:tc>
-          <w:tcPr>
-            <w:tcW w:type="dxa" w:w="1949"/>
-            <w:tcBorders>
-              <w:top w:val="single" w:color="C9D1DE" w:sz="4"/>
-              <w:left w:val="single" w:color="C9D1DE" w:sz="4"/>
-              <w:bottom w:val="single" w:color="C9D1DE" w:sz="4"/>
-              <w:right w:val="single" w:color="C9D1DE" w:sz="4"/>
-            </w:tcBorders>
-            <w:tcMar>
-              <w:top w:type="dxa" w:w="70"/>
-              <w:left w:type="dxa" w:w="100"/>
-              <w:bottom w:type="dxa" w:w="70"/>
-              <w:right w:type="dxa" w:w="100"/>
-            </w:tcMar>
-          </w:tcPr>
-          <w:p>
-            <w:pPr>
-              <w:spacing w:after="30"/>
-            </w:pPr>
-            <w:r>
-              <w:rPr>
-                <w:rFonts w:ascii="Calibri" w:cs="Calibri" w:eastAsia="Calibri" w:hAnsi="Calibri"/>
-                <w:b w:val="false"/>
-                <w:bCs w:val="false"/>
-                <w:sz w:val="19"/>
-                <w:szCs w:val="19"/>
-              </w:rPr>
-              <w:t xml:space="preserve">Nudge now</w:t>
-            </w:r>
-          </w:p>
-        </w:tc>
-        <w:tc>
-          <w:tcPr>
-            <w:tcW w:type="dxa" w:w="4657"/>
-            <w:tcBorders>
-              <w:top w:val="single" w:color="C9D1DE" w:sz="4"/>
-              <w:left w:val="single" w:color="C9D1DE" w:sz="4"/>
-              <w:bottom w:val="single" w:color="C9D1DE" w:sz="4"/>
-              <w:right w:val="single" w:color="C9D1DE" w:sz="4"/>
-            </w:tcBorders>
-            <w:tcMar>
-              <w:top w:type="dxa" w:w="70"/>
-              <w:left w:type="dxa" w:w="100"/>
-              <w:bottom w:type="dxa" w:w="70"/>
-              <w:right w:type="dxa" w:w="100"/>
-            </w:tcMar>
-          </w:tcPr>
-          <w:p>
-            <w:pPr>
-              <w:spacing w:after="30"/>
-            </w:pPr>
-            <w:r>
-              <w:rPr>
-                <w:rFonts w:ascii="Calibri" w:cs="Calibri" w:eastAsia="Calibri" w:hAnsi="Calibri"/>
-                <w:b w:val="false"/>
-                <w:bCs w:val="false"/>
-                <w:sz w:val="19"/>
-                <w:szCs w:val="19"/>
-              </w:rPr>
-              <w:t xml:space="preserve">10-08: led Desible.ai's Rs 32 crore round (BFSI AI software). [firm]</w:t>
+              <w:t xml:space="preserve">1 Oct: portfolio company Settle (B2B payments and inventory) secures a $240M credit facility.</w:t>
             </w:r>
           </w:p>
         </w:tc>
@@ -6196,7 +6066,266 @@
           <w:sz w:val="30"/>
           <w:szCs w:val="30"/>
         </w:rPr>
-        <w:t xml:space="preserve">7. Assumptions and limitations</w:t>
+        <w:t xml:space="preserve">7. The dashboard</w:t>
+      </w:r>
+    </w:p>
+    <w:p>
+      <w:pPr>
+        <w:spacing w:after="120" w:before="0"/>
+      </w:pPr>
+      <w:r>
+        <w:rPr>
+          <w:rFonts w:ascii="Calibri" w:cs="Calibri" w:eastAsia="Calibri" w:hAnsi="Calibri"/>
+          <w:sz w:val="21"/>
+          <w:szCs w:val="21"/>
+        </w:rPr>
+        <w:t xml:space="preserve">Vikram opens one page on Monday and Thursday morning. It is built to be scanned in under a minute:</w:t>
+      </w:r>
+    </w:p>
+    <w:p>
+      <w:pPr>
+        <w:pStyle w:val="ListParagraph"/>
+        <w:numPr>
+          <w:ilvl w:val="0"/>
+          <w:numId w:val="2"/>
+        </w:numPr>
+        <w:spacing w:after="60" w:before="0"/>
+      </w:pPr>
+      <w:r>
+        <w:rPr>
+          <w:rFonts w:ascii="Calibri" w:cs="Calibri" w:eastAsia="Calibri" w:hAnsi="Calibri"/>
+          <w:b/>
+          <w:bCs/>
+          <w:sz w:val="21"/>
+          <w:szCs w:val="21"/>
+        </w:rPr>
+        <w:t xml:space="preserve">Weekly brief: </w:t>
+      </w:r>
+      <w:r>
+        <w:rPr>
+          <w:rFonts w:ascii="Calibri" w:cs="Calibri" w:eastAsia="Calibri" w:hAnsi="Calibri"/>
+          <w:sz w:val="21"/>
+          <w:szCs w:val="21"/>
+        </w:rPr>
+        <w:t xml:space="preserve">one sentence with the plan ("Reach out to 1 and nudge 7. 22 are quiet"), a bar showing all 50 VCs by action, last and next run times, and the notes-untouched check.</w:t>
+      </w:r>
+    </w:p>
+    <w:p>
+      <w:pPr>
+        <w:pStyle w:val="ListParagraph"/>
+        <w:numPr>
+          <w:ilvl w:val="0"/>
+          <w:numId w:val="2"/>
+        </w:numPr>
+        <w:spacing w:after="60" w:before="0"/>
+      </w:pPr>
+      <w:r>
+        <w:rPr>
+          <w:rFonts w:ascii="Calibri" w:cs="Calibri" w:eastAsia="Calibri" w:hAnsi="Calibri"/>
+          <w:b/>
+          <w:bCs/>
+          <w:sz w:val="21"/>
+          <w:szCs w:val="21"/>
+        </w:rPr>
+        <w:t xml:space="preserve">Priority queue: </w:t>
+      </w:r>
+      <w:r>
+        <w:rPr>
+          <w:rFonts w:ascii="Calibri" w:cs="Calibri" w:eastAsia="Calibri" w:hAnsi="Calibri"/>
+          <w:sz w:val="21"/>
+          <w:szCs w:val="21"/>
+        </w:rPr>
+        <w:t xml:space="preserve">only the VCs worth contacting, ranked by score. Each card shows the evidence (date, type, relevance, link), a 30-day signal strip, the score against the outreach line, and his own note.</w:t>
+      </w:r>
+    </w:p>
+    <w:p>
+      <w:pPr>
+        <w:pStyle w:val="ListParagraph"/>
+        <w:numPr>
+          <w:ilvl w:val="0"/>
+          <w:numId w:val="2"/>
+        </w:numPr>
+        <w:spacing w:after="60" w:before="0"/>
+      </w:pPr>
+      <w:r>
+        <w:rPr>
+          <w:rFonts w:ascii="Calibri" w:cs="Calibri" w:eastAsia="Calibri" w:hAnsi="Calibri"/>
+          <w:b/>
+          <w:bCs/>
+          <w:sz w:val="21"/>
+          <w:szCs w:val="21"/>
+        </w:rPr>
+        <w:t xml:space="preserve">Email drafts: </w:t>
+      </w:r>
+      <w:r>
+        <w:rPr>
+          <w:rFonts w:ascii="Calibri" w:cs="Calibri" w:eastAsia="Calibri" w:hAnsi="Calibri"/>
+          <w:sz w:val="21"/>
+          <w:szCs w:val="21"/>
+        </w:rPr>
+        <w:t xml:space="preserve">open in a side panel, editable, with Open in Gmail and Copy. The draft opens with the specific signal.</w:t>
+      </w:r>
+    </w:p>
+    <w:p>
+      <w:pPr>
+        <w:pStyle w:val="ListParagraph"/>
+        <w:numPr>
+          <w:ilvl w:val="0"/>
+          <w:numId w:val="2"/>
+        </w:numPr>
+        <w:spacing w:after="60" w:before="0"/>
+      </w:pPr>
+      <w:r>
+        <w:rPr>
+          <w:rFonts w:ascii="Calibri" w:cs="Calibri" w:eastAsia="Calibri" w:hAnsi="Calibri"/>
+          <w:b/>
+          <w:bCs/>
+          <w:sz w:val="21"/>
+          <w:szCs w:val="21"/>
+        </w:rPr>
+        <w:t xml:space="preserve">Run proof: </w:t>
+      </w:r>
+      <w:r>
+        <w:rPr>
+          <w:rFonts w:ascii="Calibri" w:cs="Calibri" w:eastAsia="Calibri" w:hAnsi="Calibri"/>
+          <w:sz w:val="21"/>
+          <w:szCs w:val="21"/>
+        </w:rPr>
+        <w:t xml:space="preserve">which columns a run writes and which it never writes, plus a history of recent runs with a notes-safe check on each.</w:t>
+      </w:r>
+    </w:p>
+    <w:p>
+      <w:pPr>
+        <w:pStyle w:val="ListParagraph"/>
+        <w:numPr>
+          <w:ilvl w:val="0"/>
+          <w:numId w:val="2"/>
+        </w:numPr>
+        <w:spacing w:after="60" w:before="0"/>
+      </w:pPr>
+      <w:r>
+        <w:rPr>
+          <w:rFonts w:ascii="Calibri" w:cs="Calibri" w:eastAsia="Calibri" w:hAnsi="Calibri"/>
+          <w:b/>
+          <w:bCs/>
+          <w:sz w:val="21"/>
+          <w:szCs w:val="21"/>
+        </w:rPr>
+        <w:t xml:space="preserve">Full pipeline: </w:t>
+      </w:r>
+      <w:r>
+        <w:rPr>
+          <w:rFonts w:ascii="Calibri" w:cs="Calibri" w:eastAsia="Calibri" w:hAnsi="Calibri"/>
+          <w:sz w:val="21"/>
+          <w:szCs w:val="21"/>
+        </w:rPr>
+        <w:t xml:space="preserve">all 50 VCs with filters and search. Clicking a VC opens the details panel where Vikram edits status, last contact, email, contact history and notes. Signal columns are shown locked.</w:t>
+      </w:r>
+    </w:p>
+    <w:p>
+      <w:pPr>
+        <w:pStyle w:val="ListParagraph"/>
+        <w:numPr>
+          <w:ilvl w:val="0"/>
+          <w:numId w:val="2"/>
+        </w:numPr>
+        <w:spacing w:after="60" w:before="0"/>
+      </w:pPr>
+      <w:r>
+        <w:rPr>
+          <w:rFonts w:ascii="Calibri" w:cs="Calibri" w:eastAsia="Calibri" w:hAnsi="Calibri"/>
+          <w:b/>
+          <w:bCs/>
+          <w:sz w:val="21"/>
+          <w:szCs w:val="21"/>
+        </w:rPr>
+        <w:t xml:space="preserve">Run now: </w:t>
+      </w:r>
+      <w:r>
+        <w:rPr>
+          <w:rFonts w:ascii="Calibri" w:cs="Calibri" w:eastAsia="Calibri" w:hAnsi="Calibri"/>
+          <w:sz w:val="21"/>
+          <w:szCs w:val="21"/>
+        </w:rPr>
+        <w:t xml:space="preserve">starts a full refresh with a live progress bar. Light and dark themes, and it works on a phone.</w:t>
+      </w:r>
+    </w:p>
+    <w:p>
+      <w:pPr>
+        <w:spacing w:before="120"/>
+        <w:jc w:val="center"/>
+      </w:pPr>
+      <w:r>
+        <w:drawing>
+          <wp:inline distT="0" distB="0" distL="0" distR="0">
+            <wp:extent cx="6191250" cy="6448425"/>
+            <wp:effectExtent t="0" r="0" b="0" l="0"/>
+            <wp:docPr id="2" name="" descr="" title=""/>
+            <wp:cNvGraphicFramePr>
+              <a:graphicFrameLocks xmlns:a="http://schemas.openxmlformats.org/drawingml/2006/main" noChangeAspect="1"/>
+            </wp:cNvGraphicFramePr>
+            <a:graphic xmlns:a="http://schemas.openxmlformats.org/drawingml/2006/main">
+              <a:graphicData uri="http://schemas.openxmlformats.org/drawingml/2006/picture">
+                <pic:pic xmlns:pic="http://schemas.openxmlformats.org/drawingml/2006/picture">
+                  <pic:nvPicPr>
+                    <pic:cNvPr id="0" name="" descr=""/>
+                    <pic:cNvPicPr>
+                      <a:picLocks noChangeAspect="1" noChangeArrowheads="1"/>
+                    </pic:cNvPicPr>
+                  </pic:nvPicPr>
+                  <pic:blipFill>
+                    <a:blip r:embed="rId13" cstate="none"/>
+                    <a:srcRect/>
+                    <a:stretch>
+                      <a:fillRect/>
+                    </a:stretch>
+                  </pic:blipFill>
+                  <pic:spPr bwMode="auto">
+                    <a:xfrm>
+                      <a:off x="0" y="0"/>
+                      <a:ext cx="6191250" cy="6448425"/>
+                    </a:xfrm>
+                    <a:prstGeom prst="rect">
+                      <a:avLst/>
+                    </a:prstGeom>
+                  </pic:spPr>
+                </pic:pic>
+              </a:graphicData>
+            </a:graphic>
+          </wp:inline>
+        </w:drawing>
+      </w:r>
+    </w:p>
+    <w:p>
+      <w:pPr>
+        <w:spacing w:after="120" w:before="60"/>
+        <w:jc w:val="center"/>
+      </w:pPr>
+      <w:r>
+        <w:rPr>
+          <w:rFonts w:ascii="Calibri" w:cs="Calibri" w:eastAsia="Calibri" w:hAnsi="Calibri"/>
+          <w:color w:val="5A6478"/>
+          <w:sz w:val="18"/>
+          <w:szCs w:val="18"/>
+        </w:rPr>
+        <w:t xml:space="preserve">Live dashboard after the final run (light theme, desktop width).</w:t>
+      </w:r>
+    </w:p>
+    <w:p>
+      <w:pPr>
+        <w:pStyle w:val="Heading1"/>
+        <w:spacing w:after="120" w:before="280"/>
+      </w:pPr>
+      <w:r>
+        <w:rPr>
+          <w:rFonts w:ascii="Calibri" w:cs="Calibri" w:eastAsia="Calibri" w:hAnsi="Calibri"/>
+          <w:b/>
+          <w:bCs/>
+          <w:color w:val="13294B"/>
+          <w:sz w:val="30"/>
+          <w:szCs w:val="30"/>
+        </w:rPr>
+        <w:t xml:space="preserve">8. Assumptions and limitations</w:t>
       </w:r>
     </w:p>
     <w:p>
@@ -6215,6 +6344,24 @@
           <w:szCs w:val="21"/>
         </w:rPr>
         <w:t xml:space="preserve">Thresholds (score 30 for outreach, 10 days before a nudge) are starting assumptions in one file, src/scoring.js, and can be tuned with Vikram.</w:t>
+      </w:r>
+    </w:p>
+    <w:p>
+      <w:pPr>
+        <w:pStyle w:val="ListParagraph"/>
+        <w:numPr>
+          <w:ilvl w:val="0"/>
+          <w:numId w:val="2"/>
+        </w:numPr>
+        <w:spacing w:after="60" w:before="0"/>
+      </w:pPr>
+      <w:r>
+        <w:rPr>
+          <w:rFonts w:ascii="Calibri" w:cs="Calibri" w:eastAsia="Calibri" w:hAnsi="Calibri"/>
+          <w:sz w:val="21"/>
+          <w:szCs w:val="21"/>
+        </w:rPr>
+        <w:t xml:space="preserve">Investor-database pages (Tracxn, Crunchbase and similar) are filtered out: they list old rounds, not something the VC did.</w:t>
       </w:r>
     </w:p>
     <w:p>

</xml_diff>

<commit_message>
Reorganise into src/core|sources|ai|pipeline; add VC import/export, mark-as-sent, what-changed, signal feedback, Gmail digest
- src/ split by responsibility; dashboard split into html/css/js; supabase/migrations match the live schema
- Add VC (checked immediately), CSV import of Vikram's sheet, CSV export
- Mark as sent: his columns updated by his own action, recommendation re-decided via apply_signal()
- Change detection vs previous run (newly actionable, heating up, went quiet) + score sparklines
- Thumbs up/down on signals; rejected items are excluded from future runs; accuracy figure
- Mon/Thu brief emailed via Apps Script (apps-script/DigestMailer.gs)
- CI, .env.example, LICENSE, .gitattributes, new README; dashboard key removed from the Components Map

Co-Authored-By: Claude Opus 5.5 <noreply@anthropic.com>
</commit_message>
<xml_diff>
--- a/docs/VC_Pipeline_Intelligence_Components_Map.docx
+++ b/docs/VC_Pipeline_Intelligence_Components_Map.docx
@@ -188,7 +188,7 @@
             <w:pPr>
               <w:spacing w:after="30"/>
             </w:pPr>
-            <w:hyperlink w:history="1" r:id="rIdkwd9t3fkxukqt_fddhwwd">
+            <w:hyperlink w:history="1" r:id="rIdsmuuccfosoynvudcqbzju">
               <w:r>
                 <w:rPr>
                   <w:rStyle w:val="Hyperlink"/>
@@ -265,7 +265,7 @@
                 <w:sz w:val="19"/>
                 <w:szCs w:val="19"/>
               </w:rPr>
-              <w:t xml:space="preserve">https://vc-pipeline-intel.vercel.app/?key=mIdok6nVPCoI</w:t>
+              <w:t xml:space="preserve">Key-protected. The access key is shared separately with the examiners.</w:t>
             </w:r>
           </w:p>
         </w:tc>
@@ -323,7 +323,7 @@
             <w:pPr>
               <w:spacing w:after="30"/>
             </w:pPr>
-            <w:hyperlink w:history="1" r:id="rIdspl_sqykng0wjzwqxqs3w">
+            <w:hyperlink w:history="1" r:id="rIdjlp5uef7r76pew3djj9uw">
               <w:r>
                 <w:rPr>
                   <w:rStyle w:val="Hyperlink"/>
@@ -2548,7 +2548,7 @@
                 <w:sz w:val="19"/>
                 <w:szCs w:val="19"/>
               </w:rPr>
-              <w:t xml:space="preserve">Vercel static page + /api/vcs</w:t>
+              <w:t xml:space="preserve">Vercel static page + /api/vcs, /api/actions</w:t>
             </w:r>
           </w:p>
         </w:tc>
@@ -2580,7 +2580,267 @@
                 <w:sz w:val="19"/>
                 <w:szCs w:val="19"/>
               </w:rPr>
-              <w:t xml:space="preserve">Reach out now, Nudge, In progress and Quiet lists with evidence links; email drafts to Gmail; inline editing of Vikram's own columns.</w:t>
+              <w:t xml:space="preserve">Reach out now, Nudge, In progress and Quiet lists with evidence links; what changed since the last run; email drafts to Gmail; mark as sent; 👍/👎 feedback; add, import and export VCs.</w:t>
+            </w:r>
+          </w:p>
+        </w:tc>
+      </w:tr>
+      <w:tr>
+        <w:tc>
+          <w:tcPr>
+            <w:tcW w:type="dxa" w:w="1204"/>
+            <w:tcBorders>
+              <w:top w:val="single" w:color="C9D1DE" w:sz="4"/>
+              <w:left w:val="single" w:color="C9D1DE" w:sz="4"/>
+              <w:bottom w:val="single" w:color="C9D1DE" w:sz="4"/>
+              <w:right w:val="single" w:color="C9D1DE" w:sz="4"/>
+            </w:tcBorders>
+            <w:tcMar>
+              <w:top w:type="dxa" w:w="70"/>
+              <w:left w:type="dxa" w:w="100"/>
+              <w:bottom w:type="dxa" w:w="70"/>
+              <w:right w:type="dxa" w:w="100"/>
+            </w:tcMar>
+          </w:tcPr>
+          <w:p>
+            <w:pPr>
+              <w:spacing w:after="30"/>
+            </w:pPr>
+            <w:r>
+              <w:rPr>
+                <w:rFonts w:ascii="Calibri" w:cs="Calibri" w:eastAsia="Calibri" w:hAnsi="Calibri"/>
+                <w:b w:val="false"/>
+                <w:bCs w:val="false"/>
+                <w:sz w:val="19"/>
+                <w:szCs w:val="19"/>
+              </w:rPr>
+              <w:t xml:space="preserve">Output</w:t>
+            </w:r>
+          </w:p>
+        </w:tc>
+        <w:tc>
+          <w:tcPr>
+            <w:tcW w:type="dxa" w:w="1642"/>
+            <w:tcBorders>
+              <w:top w:val="single" w:color="C9D1DE" w:sz="4"/>
+              <w:left w:val="single" w:color="C9D1DE" w:sz="4"/>
+              <w:bottom w:val="single" w:color="C9D1DE" w:sz="4"/>
+              <w:right w:val="single" w:color="C9D1DE" w:sz="4"/>
+            </w:tcBorders>
+            <w:tcMar>
+              <w:top w:type="dxa" w:w="70"/>
+              <w:left w:type="dxa" w:w="100"/>
+              <w:bottom w:type="dxa" w:w="70"/>
+              <w:right w:type="dxa" w:w="100"/>
+            </w:tcMar>
+          </w:tcPr>
+          <w:p>
+            <w:pPr>
+              <w:spacing w:after="30"/>
+            </w:pPr>
+            <w:r>
+              <w:rPr>
+                <w:rFonts w:ascii="Calibri" w:cs="Calibri" w:eastAsia="Calibri" w:hAnsi="Calibri"/>
+                <w:b w:val="false"/>
+                <w:bCs w:val="false"/>
+                <w:sz w:val="19"/>
+                <w:szCs w:val="19"/>
+              </w:rPr>
+              <w:t xml:space="preserve">Brief email</w:t>
+            </w:r>
+          </w:p>
+        </w:tc>
+        <w:tc>
+          <w:tcPr>
+            <w:tcW w:type="dxa" w:w="1861"/>
+            <w:tcBorders>
+              <w:top w:val="single" w:color="C9D1DE" w:sz="4"/>
+              <w:left w:val="single" w:color="C9D1DE" w:sz="4"/>
+              <w:bottom w:val="single" w:color="C9D1DE" w:sz="4"/>
+              <w:right w:val="single" w:color="C9D1DE" w:sz="4"/>
+            </w:tcBorders>
+            <w:tcMar>
+              <w:top w:type="dxa" w:w="70"/>
+              <w:left w:type="dxa" w:w="100"/>
+              <w:bottom w:type="dxa" w:w="70"/>
+              <w:right w:type="dxa" w:w="100"/>
+            </w:tcMar>
+          </w:tcPr>
+          <w:p>
+            <w:pPr>
+              <w:spacing w:after="30"/>
+            </w:pPr>
+            <w:r>
+              <w:rPr>
+                <w:rFonts w:ascii="Calibri" w:cs="Calibri" w:eastAsia="Calibri" w:hAnsi="Calibri"/>
+                <w:b w:val="false"/>
+                <w:bCs w:val="false"/>
+                <w:sz w:val="19"/>
+                <w:szCs w:val="19"/>
+              </w:rPr>
+              <w:t xml:space="preserve">Apps Script → Gmail</w:t>
+            </w:r>
+          </w:p>
+        </w:tc>
+        <w:tc>
+          <w:tcPr>
+            <w:tcW w:type="dxa" w:w="5039"/>
+            <w:tcBorders>
+              <w:top w:val="single" w:color="C9D1DE" w:sz="4"/>
+              <w:left w:val="single" w:color="C9D1DE" w:sz="4"/>
+              <w:bottom w:val="single" w:color="C9D1DE" w:sz="4"/>
+              <w:right w:val="single" w:color="C9D1DE" w:sz="4"/>
+            </w:tcBorders>
+            <w:tcMar>
+              <w:top w:type="dxa" w:w="70"/>
+              <w:left w:type="dxa" w:w="100"/>
+              <w:bottom w:type="dxa" w:w="70"/>
+              <w:right w:type="dxa" w:w="100"/>
+            </w:tcMar>
+          </w:tcPr>
+          <w:p>
+            <w:pPr>
+              <w:spacing w:after="30"/>
+            </w:pPr>
+            <w:r>
+              <w:rPr>
+                <w:rFonts w:ascii="Calibri" w:cs="Calibri" w:eastAsia="Calibri" w:hAnsi="Calibri"/>
+                <w:b w:val="false"/>
+                <w:bCs w:val="false"/>
+                <w:sz w:val="19"/>
+                <w:szCs w:val="19"/>
+              </w:rPr>
+              <w:t xml:space="preserve">After each scheduled run, emails Vikram who to reach out to, who to nudge and who is quiet.</w:t>
+            </w:r>
+          </w:p>
+        </w:tc>
+      </w:tr>
+      <w:tr>
+        <w:tc>
+          <w:tcPr>
+            <w:tcW w:type="dxa" w:w="1204"/>
+            <w:tcBorders>
+              <w:top w:val="single" w:color="C9D1DE" w:sz="4"/>
+              <w:left w:val="single" w:color="C9D1DE" w:sz="4"/>
+              <w:bottom w:val="single" w:color="C9D1DE" w:sz="4"/>
+              <w:right w:val="single" w:color="C9D1DE" w:sz="4"/>
+            </w:tcBorders>
+            <w:tcMar>
+              <w:top w:type="dxa" w:w="70"/>
+              <w:left w:type="dxa" w:w="100"/>
+              <w:bottom w:type="dxa" w:w="70"/>
+              <w:right w:type="dxa" w:w="100"/>
+            </w:tcMar>
+          </w:tcPr>
+          <w:p>
+            <w:pPr>
+              <w:spacing w:after="30"/>
+            </w:pPr>
+            <w:r>
+              <w:rPr>
+                <w:rFonts w:ascii="Calibri" w:cs="Calibri" w:eastAsia="Calibri" w:hAnsi="Calibri"/>
+                <w:b w:val="false"/>
+                <w:bCs w:val="false"/>
+                <w:sz w:val="19"/>
+                <w:szCs w:val="19"/>
+              </w:rPr>
+              <w:t xml:space="preserve">Context</w:t>
+            </w:r>
+          </w:p>
+        </w:tc>
+        <w:tc>
+          <w:tcPr>
+            <w:tcW w:type="dxa" w:w="1642"/>
+            <w:tcBorders>
+              <w:top w:val="single" w:color="C9D1DE" w:sz="4"/>
+              <w:left w:val="single" w:color="C9D1DE" w:sz="4"/>
+              <w:bottom w:val="single" w:color="C9D1DE" w:sz="4"/>
+              <w:right w:val="single" w:color="C9D1DE" w:sz="4"/>
+            </w:tcBorders>
+            <w:tcMar>
+              <w:top w:type="dxa" w:w="70"/>
+              <w:left w:type="dxa" w:w="100"/>
+              <w:bottom w:type="dxa" w:w="70"/>
+              <w:right w:type="dxa" w:w="100"/>
+            </w:tcMar>
+          </w:tcPr>
+          <w:p>
+            <w:pPr>
+              <w:spacing w:after="30"/>
+            </w:pPr>
+            <w:r>
+              <w:rPr>
+                <w:rFonts w:ascii="Calibri" w:cs="Calibri" w:eastAsia="Calibri" w:hAnsi="Calibri"/>
+                <w:b w:val="false"/>
+                <w:bCs w:val="false"/>
+                <w:sz w:val="19"/>
+                <w:szCs w:val="19"/>
+              </w:rPr>
+              <w:t xml:space="preserve">Feedback</w:t>
+            </w:r>
+          </w:p>
+        </w:tc>
+        <w:tc>
+          <w:tcPr>
+            <w:tcW w:type="dxa" w:w="1861"/>
+            <w:tcBorders>
+              <w:top w:val="single" w:color="C9D1DE" w:sz="4"/>
+              <w:left w:val="single" w:color="C9D1DE" w:sz="4"/>
+              <w:bottom w:val="single" w:color="C9D1DE" w:sz="4"/>
+              <w:right w:val="single" w:color="C9D1DE" w:sz="4"/>
+            </w:tcBorders>
+            <w:tcMar>
+              <w:top w:type="dxa" w:w="70"/>
+              <w:left w:type="dxa" w:w="100"/>
+              <w:bottom w:type="dxa" w:w="70"/>
+              <w:right w:type="dxa" w:w="100"/>
+            </w:tcMar>
+          </w:tcPr>
+          <w:p>
+            <w:pPr>
+              <w:spacing w:after="30"/>
+            </w:pPr>
+            <w:r>
+              <w:rPr>
+                <w:rFonts w:ascii="Calibri" w:cs="Calibri" w:eastAsia="Calibri" w:hAnsi="Calibri"/>
+                <w:b w:val="false"/>
+                <w:bCs w:val="false"/>
+                <w:sz w:val="19"/>
+                <w:szCs w:val="19"/>
+              </w:rPr>
+              <w:t xml:space="preserve">Supabase signal_feedback</w:t>
+            </w:r>
+          </w:p>
+        </w:tc>
+        <w:tc>
+          <w:tcPr>
+            <w:tcW w:type="dxa" w:w="5039"/>
+            <w:tcBorders>
+              <w:top w:val="single" w:color="C9D1DE" w:sz="4"/>
+              <w:left w:val="single" w:color="C9D1DE" w:sz="4"/>
+              <w:bottom w:val="single" w:color="C9D1DE" w:sz="4"/>
+              <w:right w:val="single" w:color="C9D1DE" w:sz="4"/>
+            </w:tcBorders>
+            <w:tcMar>
+              <w:top w:type="dxa" w:w="70"/>
+              <w:left w:type="dxa" w:w="100"/>
+              <w:bottom w:type="dxa" w:w="70"/>
+              <w:right w:type="dxa" w:w="100"/>
+            </w:tcMar>
+          </w:tcPr>
+          <w:p>
+            <w:pPr>
+              <w:spacing w:after="30"/>
+            </w:pPr>
+            <w:r>
+              <w:rPr>
+                <w:rFonts w:ascii="Calibri" w:cs="Calibri" w:eastAsia="Calibri" w:hAnsi="Calibri"/>
+                <w:b w:val="false"/>
+                <w:bCs w:val="false"/>
+                <w:sz w:val="19"/>
+                <w:szCs w:val="19"/>
+              </w:rPr>
+              <w:t xml:space="preserve">Signals Vikram marks not relevant are excluded from future runs for that VC; the ratings give an accuracy figure.</w:t>
             </w:r>
           </w:p>
         </w:tc>
@@ -6239,6 +6499,146 @@
           <w:sz w:val="21"/>
           <w:szCs w:val="21"/>
         </w:rPr>
+        <w:t xml:space="preserve">What changed: </w:t>
+      </w:r>
+      <w:r>
+        <w:rPr>
+          <w:rFonts w:ascii="Calibri" w:cs="Calibri" w:eastAsia="Calibri" w:hAnsi="Calibri"/>
+          <w:sz w:val="21"/>
+          <w:szCs w:val="21"/>
+        </w:rPr>
+        <w:t xml:space="preserve">each VC is compared with the previous run: "New this run", "heating up", "went quiet", new signals, and a score sparkline over recent runs.</w:t>
+      </w:r>
+    </w:p>
+    <w:p>
+      <w:pPr>
+        <w:pStyle w:val="ListParagraph"/>
+        <w:numPr>
+          <w:ilvl w:val="0"/>
+          <w:numId w:val="2"/>
+        </w:numPr>
+        <w:spacing w:after="60" w:before="0"/>
+      </w:pPr>
+      <w:r>
+        <w:rPr>
+          <w:rFonts w:ascii="Calibri" w:cs="Calibri" w:eastAsia="Calibri" w:hAnsi="Calibri"/>
+          <w:b/>
+          <w:bCs/>
+          <w:sz w:val="21"/>
+          <w:szCs w:val="21"/>
+        </w:rPr>
+        <w:t xml:space="preserve">Mark as sent: </w:t>
+      </w:r>
+      <w:r>
+        <w:rPr>
+          <w:rFonts w:ascii="Calibri" w:cs="Calibri" w:eastAsia="Calibri" w:hAnsi="Calibri"/>
+          <w:sz w:val="21"/>
+          <w:szCs w:val="21"/>
+        </w:rPr>
+        <w:t xml:space="preserve">after sending a draft, one click sets status to waiting for reply, last contact to today and adds a line to his contact history. The recommendation switches to Hold, so the next run will not chase that VC for 10 days. These are his columns, changed by his own action, never by a run.</w:t>
+      </w:r>
+    </w:p>
+    <w:p>
+      <w:pPr>
+        <w:pStyle w:val="ListParagraph"/>
+        <w:numPr>
+          <w:ilvl w:val="0"/>
+          <w:numId w:val="2"/>
+        </w:numPr>
+        <w:spacing w:after="60" w:before="0"/>
+      </w:pPr>
+      <w:r>
+        <w:rPr>
+          <w:rFonts w:ascii="Calibri" w:cs="Calibri" w:eastAsia="Calibri" w:hAnsi="Calibri"/>
+          <w:b/>
+          <w:bCs/>
+          <w:sz w:val="21"/>
+          <w:szCs w:val="21"/>
+        </w:rPr>
+        <w:t xml:space="preserve">Feedback loop: </w:t>
+      </w:r>
+      <w:r>
+        <w:rPr>
+          <w:rFonts w:ascii="Calibri" w:cs="Calibri" w:eastAsia="Calibri" w:hAnsi="Calibri"/>
+          <w:sz w:val="21"/>
+          <w:szCs w:val="21"/>
+        </w:rPr>
+        <w:t xml:space="preserve">👍 / 👎 on every signal. 👎 removes that item from future runs for that VC, and the ratings give a live accuracy figure (share of rated signals that were useful).</w:t>
+      </w:r>
+    </w:p>
+    <w:p>
+      <w:pPr>
+        <w:pStyle w:val="ListParagraph"/>
+        <w:numPr>
+          <w:ilvl w:val="0"/>
+          <w:numId w:val="2"/>
+        </w:numPr>
+        <w:spacing w:after="60" w:before="0"/>
+      </w:pPr>
+      <w:r>
+        <w:rPr>
+          <w:rFonts w:ascii="Calibri" w:cs="Calibri" w:eastAsia="Calibri" w:hAnsi="Calibri"/>
+          <w:b/>
+          <w:bCs/>
+          <w:sz w:val="21"/>
+          <w:szCs w:val="21"/>
+        </w:rPr>
+        <w:t xml:space="preserve">Pipeline management: </w:t>
+      </w:r>
+      <w:r>
+        <w:rPr>
+          <w:rFonts w:ascii="Calibri" w:cs="Calibri" w:eastAsia="Calibri" w:hAnsi="Calibri"/>
+          <w:sz w:val="21"/>
+          <w:szCs w:val="21"/>
+        </w:rPr>
+        <w:t xml:space="preserve">add a VC (it is checked within about 20 seconds), import his spreadsheet as CSV (his own headings such as "Partner" and "Fund" are recognised, duplicates skipped), and export to CSV.</w:t>
+      </w:r>
+    </w:p>
+    <w:p>
+      <w:pPr>
+        <w:pStyle w:val="ListParagraph"/>
+        <w:numPr>
+          <w:ilvl w:val="0"/>
+          <w:numId w:val="2"/>
+        </w:numPr>
+        <w:spacing w:after="60" w:before="0"/>
+      </w:pPr>
+      <w:r>
+        <w:rPr>
+          <w:rFonts w:ascii="Calibri" w:cs="Calibri" w:eastAsia="Calibri" w:hAnsi="Calibri"/>
+          <w:b/>
+          <w:bCs/>
+          <w:sz w:val="21"/>
+          <w:szCs w:val="21"/>
+        </w:rPr>
+        <w:t xml:space="preserve">Brief by email: </w:t>
+      </w:r>
+      <w:r>
+        <w:rPr>
+          <w:rFonts w:ascii="Calibri" w:cs="Calibri" w:eastAsia="Calibri" w:hAnsi="Calibri"/>
+          <w:sz w:val="21"/>
+          <w:szCs w:val="21"/>
+        </w:rPr>
+        <w:t xml:space="preserve">after each scheduled run, the same brief is emailed to him from his own Gmail through a small Apps Script, so it is waiting before he starts work.</w:t>
+      </w:r>
+    </w:p>
+    <w:p>
+      <w:pPr>
+        <w:pStyle w:val="ListParagraph"/>
+        <w:numPr>
+          <w:ilvl w:val="0"/>
+          <w:numId w:val="2"/>
+        </w:numPr>
+        <w:spacing w:after="60" w:before="0"/>
+      </w:pPr>
+      <w:r>
+        <w:rPr>
+          <w:rFonts w:ascii="Calibri" w:cs="Calibri" w:eastAsia="Calibri" w:hAnsi="Calibri"/>
+          <w:b/>
+          <w:bCs/>
+          <w:sz w:val="21"/>
+          <w:szCs w:val="21"/>
+        </w:rPr>
         <w:t xml:space="preserve">Run now: </w:t>
       </w:r>
       <w:r>
@@ -6258,7 +6658,7 @@
       <w:r>
         <w:drawing>
           <wp:inline distT="0" distB="0" distL="0" distR="0">
-            <wp:extent cx="6191250" cy="6448425"/>
+            <wp:extent cx="6191250" cy="6019800"/>
             <wp:effectExtent t="0" r="0" b="0" l="0"/>
             <wp:docPr id="2" name="" descr="" title=""/>
             <wp:cNvGraphicFramePr>
@@ -6283,7 +6683,7 @@
                   <pic:spPr bwMode="auto">
                     <a:xfrm>
                       <a:off x="0" y="0"/>
-                      <a:ext cx="6191250" cy="6448425"/>
+                      <a:ext cx="6191250" cy="6019800"/>
                     </a:xfrm>
                     <a:prstGeom prst="rect">
                       <a:avLst/>

</xml_diff>

<commit_message>
Open dashboard (key optional); manual runs POST-only; a second Run now joins the run in progress
Co-Authored-By: Claude Opus 5.5 <noreply@anthropic.com>
</commit_message>
<xml_diff>
--- a/docs/VC_Pipeline_Intelligence_Components_Map.docx
+++ b/docs/VC_Pipeline_Intelligence_Components_Map.docx
@@ -188,7 +188,7 @@
             <w:pPr>
               <w:spacing w:after="30"/>
             </w:pPr>
-            <w:hyperlink w:history="1" r:id="rIdsmuuccfosoynvudcqbzju">
+            <w:hyperlink w:history="1" r:id="rIdna5j8gsnsoypxo-dd0z_d">
               <w:r>
                 <w:rPr>
                   <w:rStyle w:val="Hyperlink"/>
@@ -265,7 +265,7 @@
                 <w:sz w:val="19"/>
                 <w:szCs w:val="19"/>
               </w:rPr>
-              <w:t xml:space="preserve">Key-protected. The access key is shared separately with the examiners.</w:t>
+              <w:t xml:space="preserve">Open: no key needed. Setting DASHBOARD_KEY in Vercel locks it again.</w:t>
             </w:r>
           </w:p>
         </w:tc>
@@ -323,7 +323,7 @@
             <w:pPr>
               <w:spacing w:after="30"/>
             </w:pPr>
-            <w:hyperlink w:history="1" r:id="rIdjlp5uef7r76pew3djj9uw">
+            <w:hyperlink w:history="1" r:id="rIdwpy3_frdfm-qr9diuwfyx">
               <w:r>
                 <w:rPr>
                   <w:rStyle w:val="Hyperlink"/>

</xml_diff>

<commit_message>
Components Map: latest run results, open-access note, fresh dashboard screenshot
Co-Authored-By: Claude Opus 5.5 <noreply@anthropic.com>
</commit_message>
<xml_diff>
--- a/docs/VC_Pipeline_Intelligence_Components_Map.docx
+++ b/docs/VC_Pipeline_Intelligence_Components_Map.docx
@@ -188,7 +188,7 @@
             <w:pPr>
               <w:spacing w:after="30"/>
             </w:pPr>
-            <w:hyperlink w:history="1" r:id="rIdna5j8gsnsoypxo-dd0z_d">
+            <w:hyperlink w:history="1" r:id="rId4i3f7qojah9zidcnfkn7d">
               <w:r>
                 <w:rPr>
                   <w:rStyle w:val="Hyperlink"/>
@@ -323,7 +323,7 @@
             <w:pPr>
               <w:spacing w:after="30"/>
             </w:pPr>
-            <w:hyperlink w:history="1" r:id="rIdwpy3_frdfm-qr9diuwfyx">
+            <w:hyperlink w:history="1" r:id="rId15ixv3hxywlupivtdswvc">
               <w:r>
                 <w:rPr>
                   <w:rStyle w:val="Hyperlink"/>
@@ -4606,7 +4606,7 @@
           <w:sz w:val="21"/>
           <w:szCs w:val="21"/>
         </w:rPr>
-        <w:t xml:space="preserve">Latest run: 11 Oct 2026, 20:16 IST (manual). 50 VCs checked, 278 validated signals from the last 30 days, completed in 3 min 24 s. Vikram's columns: untouched (fingerprints match).</w:t>
+        <w:t xml:space="preserve">Latest run: 12 Oct 2026, 00:28 IST (manual, on Vercel). 50 VCs checked, 265 validated signals from the last 30 days, completed in 3 min 7 s. Vikram's columns: untouched (fingerprints match).</w:t>
       </w:r>
     </w:p>
     <w:tbl>
@@ -5300,7 +5300,7 @@
                 <w:sz w:val="19"/>
                 <w:szCs w:val="19"/>
               </w:rPr>
-              <w:t xml:space="preserve">Santosh Sankar, Dynamo Ventures</w:t>
+              <w:t xml:space="preserve">Shailendra Singh, Peak XV Partners</w:t>
             </w:r>
           </w:p>
         </w:tc>
@@ -5332,7 +5332,7 @@
                 <w:sz w:val="19"/>
                 <w:szCs w:val="19"/>
               </w:rPr>
-              <w:t xml:space="preserve">78</w:t>
+              <w:t xml:space="preserve">75</w:t>
             </w:r>
           </w:p>
         </w:tc>
@@ -5364,7 +5364,7 @@
                 <w:sz w:val="19"/>
                 <w:szCs w:val="19"/>
               </w:rPr>
-              <w:t xml:space="preserve">Reach out now</w:t>
+              <w:t xml:space="preserve">Nudge now</w:t>
             </w:r>
           </w:p>
         </w:tc>
@@ -5396,7 +5396,7 @@
                 <w:sz w:val="19"/>
                 <w:szCs w:val="19"/>
               </w:rPr>
-              <w:t xml:space="preserve">28 Sep and 21 Sep: Dynamo's weekly newsletter on supply chain and logistics ecosystem news and venture deals.</w:t>
+              <w:t xml:space="preserve">11 Oct: Peak XV-backed supply chain platform Zetwerk sets its IPO for 15 Oct. 8 Oct: Peak XV led Plum's Rs 193 crore round.</w:t>
             </w:r>
           </w:p>
         </w:tc>
@@ -5430,7 +5430,7 @@
                 <w:sz w:val="19"/>
                 <w:szCs w:val="19"/>
               </w:rPr>
-              <w:t xml:space="preserve">Mukul Arora, Elevation Capital</w:t>
+              <w:t xml:space="preserve">Joe Lonsdale, 8VC</w:t>
             </w:r>
           </w:p>
         </w:tc>
@@ -5462,7 +5462,7 @@
                 <w:sz w:val="19"/>
                 <w:szCs w:val="19"/>
               </w:rPr>
-              <w:t xml:space="preserve">58</w:t>
+              <w:t xml:space="preserve">62</w:t>
             </w:r>
           </w:p>
         </w:tc>
@@ -5526,7 +5526,7 @@
                 <w:sz w:val="19"/>
                 <w:szCs w:val="19"/>
               </w:rPr>
-              <w:t xml:space="preserve">28 Sep: led Dextr AI's $6.7M seed. 22 Sep: blog on Indian AI agents paired with on-ground fulfilment.</w:t>
+              <w:t xml:space="preserve">9 Oct: Gallatin AI raised $50M to expand its military logistics platform. 1 Oct: Armadin raised $255.5M.</w:t>
             </w:r>
           </w:p>
         </w:tc>
@@ -5560,7 +5560,7 @@
                 <w:sz w:val="19"/>
                 <w:szCs w:val="19"/>
               </w:rPr>
-              <w:t xml:space="preserve">Shailendra Singh, Peak XV Partners</w:t>
+              <w:t xml:space="preserve">Mukul Arora, Elevation Capital</w:t>
             </w:r>
           </w:p>
         </w:tc>
@@ -5592,7 +5592,7 @@
                 <w:sz w:val="19"/>
                 <w:szCs w:val="19"/>
               </w:rPr>
-              <w:t xml:space="preserve">55</w:t>
+              <w:t xml:space="preserve">49</w:t>
             </w:r>
           </w:p>
         </w:tc>
@@ -5656,7 +5656,7 @@
                 <w:sz w:val="19"/>
                 <w:szCs w:val="19"/>
               </w:rPr>
-              <w:t xml:space="preserve">11 Oct: Peak XV-backed B2B manufacturing and supply chain platform Zetwerk launches its IPO on 15 Oct.</w:t>
+              <w:t xml:space="preserve">28 Sep: Dextr AI's $6.7M seed. 23 Sep: Elevation surveyed 30+ startup CTOs on AI in engineering teams.</w:t>
             </w:r>
           </w:p>
         </w:tc>
@@ -5690,7 +5690,7 @@
                 <w:sz w:val="19"/>
                 <w:szCs w:val="19"/>
               </w:rPr>
-              <w:t xml:space="preserve">Joe Lonsdale, 8VC</w:t>
+              <w:t xml:space="preserve">Rachel Holt, Construct Capital</w:t>
             </w:r>
           </w:p>
         </w:tc>
@@ -5722,7 +5722,7 @@
                 <w:sz w:val="19"/>
                 <w:szCs w:val="19"/>
               </w:rPr>
-              <w:t xml:space="preserve">52</w:t>
+              <w:t xml:space="preserve">43</w:t>
             </w:r>
           </w:p>
         </w:tc>
@@ -5754,7 +5754,7 @@
                 <w:sz w:val="19"/>
                 <w:szCs w:val="19"/>
               </w:rPr>
-              <w:t xml:space="preserve">Nudge now</w:t>
+              <w:t xml:space="preserve">Reach out now</w:t>
             </w:r>
           </w:p>
         </w:tc>
@@ -5786,7 +5786,7 @@
                 <w:sz w:val="19"/>
                 <w:szCs w:val="19"/>
               </w:rPr>
-              <w:t xml:space="preserve">9 Oct: Gallatin AI raised a $50M Series A for its military logistics platform.</w:t>
+              <w:t xml:space="preserve">8 Oct: Polygrade raised $6.3M. 17 Sep: BackOps raised $42M for AI supply chain automation.</w:t>
             </w:r>
           </w:p>
         </w:tc>
@@ -5820,7 +5820,7 @@
                 <w:sz w:val="19"/>
                 <w:szCs w:val="19"/>
               </w:rPr>
-              <w:t xml:space="preserve">Kunal Bahl, Titan Capital</w:t>
+              <w:t xml:space="preserve">Steve Sarracino, Activant Capital</w:t>
             </w:r>
           </w:p>
         </w:tc>
@@ -5852,7 +5852,7 @@
                 <w:sz w:val="19"/>
                 <w:szCs w:val="19"/>
               </w:rPr>
-              <w:t xml:space="preserve">40</w:t>
+              <w:t xml:space="preserve">43</w:t>
             </w:r>
           </w:p>
         </w:tc>
@@ -5916,7 +5916,7 @@
                 <w:sz w:val="19"/>
                 <w:szCs w:val="19"/>
               </w:rPr>
-              <w:t xml:space="preserve">30 Sep: portfolio company Blitz (quick-commerce fulfilment) raises at a higher valuation.</w:t>
+              <w:t xml:space="preserve">6 Oct: blog on legal AI value capture. 15 Sep: blog on retrofit autonomy kits for construction and mining equipment.</w:t>
             </w:r>
           </w:p>
         </w:tc>
@@ -5950,7 +5950,7 @@
                 <w:sz w:val="19"/>
                 <w:szCs w:val="19"/>
               </w:rPr>
-              <w:t xml:space="preserve">Anand Lunia, India Quotient</w:t>
+              <w:t xml:space="preserve">Kunal Bahl, Titan Capital</w:t>
             </w:r>
           </w:p>
         </w:tc>
@@ -5982,7 +5982,7 @@
                 <w:sz w:val="19"/>
                 <w:szCs w:val="19"/>
               </w:rPr>
-              <w:t xml:space="preserve">40</w:t>
+              <w:t xml:space="preserve">38</w:t>
             </w:r>
           </w:p>
         </w:tc>
@@ -6046,7 +6046,7 @@
                 <w:sz w:val="19"/>
                 <w:szCs w:val="19"/>
               </w:rPr>
-              <w:t xml:space="preserve">30 Sep: portfolio company Blitz (quick-commerce fulfilment) kicks off its pre-Series B.</w:t>
+              <w:t xml:space="preserve">30 Sep: quick-commerce fulfilment startup Blitz starts its pre-Series B at a higher valuation.</w:t>
             </w:r>
           </w:p>
         </w:tc>
@@ -6080,7 +6080,7 @@
                 <w:sz w:val="19"/>
                 <w:szCs w:val="19"/>
               </w:rPr>
-              <w:t xml:space="preserve">Shripati Acharya, Prime Venture Partners</w:t>
+              <w:t xml:space="preserve">Anand Lunia, India Quotient</w:t>
             </w:r>
           </w:p>
         </w:tc>
@@ -6112,7 +6112,7 @@
                 <w:sz w:val="19"/>
                 <w:szCs w:val="19"/>
               </w:rPr>
-              <w:t xml:space="preserve">35</w:t>
+              <w:t xml:space="preserve">36</w:t>
             </w:r>
           </w:p>
         </w:tc>
@@ -6176,7 +6176,7 @@
                 <w:sz w:val="19"/>
                 <w:szCs w:val="19"/>
               </w:rPr>
-              <w:t xml:space="preserve">8 Oct: led Desible.ai's Rs 32 crore seed round (B2B AI for BFSI).</w:t>
+              <w:t xml:space="preserve">30 Sep: portfolio company Blitz (quick-commerce fulfilment) kicks off its pre-Series B.</w:t>
             </w:r>
           </w:p>
         </w:tc>
@@ -6210,7 +6210,7 @@
                 <w:sz w:val="19"/>
                 <w:szCs w:val="19"/>
               </w:rPr>
-              <w:t xml:space="preserve">Steve Sarracino, Activant Capital</w:t>
+              <w:t xml:space="preserve">Shripati Acharya, Prime Venture Partners</w:t>
             </w:r>
           </w:p>
         </w:tc>
@@ -6242,7 +6242,7 @@
                 <w:sz w:val="19"/>
                 <w:szCs w:val="19"/>
               </w:rPr>
-              <w:t xml:space="preserve">33</w:t>
+              <w:t xml:space="preserve">30</w:t>
             </w:r>
           </w:p>
         </w:tc>
@@ -6306,7 +6306,7 @@
                 <w:sz w:val="19"/>
                 <w:szCs w:val="19"/>
               </w:rPr>
-              <w:t xml:space="preserve">1 Oct: portfolio company Settle (B2B payments and inventory) secures a $240M credit facility.</w:t>
+              <w:t xml:space="preserve">8 Oct: Prime invested Rs 32 crore in Desible.ai (B2B AI operating layer).</w:t>
             </w:r>
           </w:p>
         </w:tc>

</xml_diff>

<commit_message>
Components Map: latest run (run 10), testing and verification section, sample draft
Co-Authored-By: Claude Opus 5.5 <noreply@anthropic.com>
</commit_message>
<xml_diff>
--- a/docs/VC_Pipeline_Intelligence_Components_Map.docx
+++ b/docs/VC_Pipeline_Intelligence_Components_Map.docx
@@ -188,7 +188,7 @@
             <w:pPr>
               <w:spacing w:after="30"/>
             </w:pPr>
-            <w:hyperlink w:history="1" r:id="rId4i3f7qojah9zidcnfkn7d">
+            <w:hyperlink w:history="1" r:id="rIdl7sj2tnir6q5e3si0hsg8">
               <w:r>
                 <w:rPr>
                   <w:rStyle w:val="Hyperlink"/>
@@ -323,7 +323,7 @@
             <w:pPr>
               <w:spacing w:after="30"/>
             </w:pPr>
-            <w:hyperlink w:history="1" r:id="rId15ixv3hxywlupivtdswvc">
+            <w:hyperlink w:history="1" r:id="rId9tiox6nky9aefxgivygte">
               <w:r>
                 <w:rPr>
                   <w:rStyle w:val="Hyperlink"/>
@@ -4606,7 +4606,7 @@
           <w:sz w:val="21"/>
           <w:szCs w:val="21"/>
         </w:rPr>
-        <w:t xml:space="preserve">Latest run: 12 Oct 2026, 00:28 IST (manual, on Vercel). 50 VCs checked, 265 validated signals from the last 30 days, completed in 3 min 7 s. Vikram's columns: untouched (fingerprints match).</w:t>
+        <w:t xml:space="preserve">Latest run: 12 Oct 2026, 01:35 IST (manual, on Vercel). 50 VCs checked, 237 validated signals from the last 30 days, completed in 3 min 17 s. Vikram's columns: untouched (fingerprints match).</w:t>
       </w:r>
     </w:p>
     <w:tbl>
@@ -5396,7 +5396,7 @@
                 <w:sz w:val="19"/>
                 <w:szCs w:val="19"/>
               </w:rPr>
-              <w:t xml:space="preserve">11 Oct: Peak XV-backed supply chain platform Zetwerk sets its IPO for 15 Oct. 8 Oct: Peak XV led Plum's Rs 193 crore round.</w:t>
+              <w:t xml:space="preserve">11 Oct: Peak XV-backed supply chain platform Zetwerk prepares its IPO. 8 Oct: Peak XV led Plum's Rs 193 crore round.</w:t>
             </w:r>
           </w:p>
         </w:tc>
@@ -5430,7 +5430,7 @@
                 <w:sz w:val="19"/>
                 <w:szCs w:val="19"/>
               </w:rPr>
-              <w:t xml:space="preserve">Joe Lonsdale, 8VC</w:t>
+              <w:t xml:space="preserve">Mukul Arora, Elevation Capital</w:t>
             </w:r>
           </w:p>
         </w:tc>
@@ -5462,7 +5462,7 @@
                 <w:sz w:val="19"/>
                 <w:szCs w:val="19"/>
               </w:rPr>
-              <w:t xml:space="preserve">62</w:t>
+              <w:t xml:space="preserve">53</w:t>
             </w:r>
           </w:p>
         </w:tc>
@@ -5526,7 +5526,7 @@
                 <w:sz w:val="19"/>
                 <w:szCs w:val="19"/>
               </w:rPr>
-              <w:t xml:space="preserve">9 Oct: Gallatin AI raised $50M to expand its military logistics platform. 1 Oct: Armadin raised $255.5M.</w:t>
+              <w:t xml:space="preserve">26 Sep: Dextr AI's $6.7M seed. 22 Sep: Elevation article on pairing AI with on-ground fulfilment in India.</w:t>
             </w:r>
           </w:p>
         </w:tc>
@@ -5560,7 +5560,7 @@
                 <w:sz w:val="19"/>
                 <w:szCs w:val="19"/>
               </w:rPr>
-              <w:t xml:space="preserve">Mukul Arora, Elevation Capital</w:t>
+              <w:t xml:space="preserve">Joe Lonsdale, 8VC</w:t>
             </w:r>
           </w:p>
         </w:tc>
@@ -5592,7 +5592,7 @@
                 <w:sz w:val="19"/>
                 <w:szCs w:val="19"/>
               </w:rPr>
-              <w:t xml:space="preserve">49</w:t>
+              <w:t xml:space="preserve">45</w:t>
             </w:r>
           </w:p>
         </w:tc>
@@ -5656,7 +5656,7 @@
                 <w:sz w:val="19"/>
                 <w:szCs w:val="19"/>
               </w:rPr>
-              <w:t xml:space="preserve">28 Sep: Dextr AI's $6.7M seed. 23 Sep: Elevation surveyed 30+ startup CTOs on AI in engineering teams.</w:t>
+              <w:t xml:space="preserve">9 Oct: Gallatin AI raised a $50M Series A for its military logistics platform.</w:t>
             </w:r>
           </w:p>
         </w:tc>
@@ -5786,7 +5786,7 @@
                 <w:sz w:val="19"/>
                 <w:szCs w:val="19"/>
               </w:rPr>
-              <w:t xml:space="preserve">8 Oct: Polygrade raised $6.3M. 17 Sep: BackOps raised $42M for AI supply chain automation.</w:t>
+              <w:t xml:space="preserve">17 Sep: co-led BackOps' $42M round for AI supply chain automation. 6 Oct: co-led Torch Systems' $11.5M round.</w:t>
             </w:r>
           </w:p>
         </w:tc>
@@ -5820,7 +5820,7 @@
                 <w:sz w:val="19"/>
                 <w:szCs w:val="19"/>
               </w:rPr>
-              <w:t xml:space="preserve">Steve Sarracino, Activant Capital</w:t>
+              <w:t xml:space="preserve">Kunal Bahl, Titan Capital</w:t>
             </w:r>
           </w:p>
         </w:tc>
@@ -5852,7 +5852,7 @@
                 <w:sz w:val="19"/>
                 <w:szCs w:val="19"/>
               </w:rPr>
-              <w:t xml:space="preserve">43</w:t>
+              <w:t xml:space="preserve">38</w:t>
             </w:r>
           </w:p>
         </w:tc>
@@ -5916,7 +5916,7 @@
                 <w:sz w:val="19"/>
                 <w:szCs w:val="19"/>
               </w:rPr>
-              <w:t xml:space="preserve">6 Oct: blog on legal AI value capture. 15 Sep: blog on retrofit autonomy kits for construction and mining equipment.</w:t>
+              <w:t xml:space="preserve">30 Sep: e-commerce fulfilment startup Blitz starts its pre-Series B at a higher valuation.</w:t>
             </w:r>
           </w:p>
         </w:tc>
@@ -5950,7 +5950,7 @@
                 <w:sz w:val="19"/>
                 <w:szCs w:val="19"/>
               </w:rPr>
-              <w:t xml:space="preserve">Kunal Bahl, Titan Capital</w:t>
+              <w:t xml:space="preserve">Steve Sarracino, Activant Capital</w:t>
             </w:r>
           </w:p>
         </w:tc>
@@ -5982,7 +5982,7 @@
                 <w:sz w:val="19"/>
                 <w:szCs w:val="19"/>
               </w:rPr>
-              <w:t xml:space="preserve">38</w:t>
+              <w:t xml:space="preserve">34</w:t>
             </w:r>
           </w:p>
         </w:tc>
@@ -6046,7 +6046,7 @@
                 <w:sz w:val="19"/>
                 <w:szCs w:val="19"/>
               </w:rPr>
-              <w:t xml:space="preserve">30 Sep: quick-commerce fulfilment startup Blitz starts its pre-Series B at a higher valuation.</w:t>
+              <w:t xml:space="preserve">6 Oct: blog on value capture in legal AI. 29 Sep: post on intelligent routing in AI systems.</w:t>
             </w:r>
           </w:p>
         </w:tc>
@@ -6112,7 +6112,7 @@
                 <w:sz w:val="19"/>
                 <w:szCs w:val="19"/>
               </w:rPr>
-              <w:t xml:space="preserve">36</w:t>
+              <w:t xml:space="preserve">34</w:t>
             </w:r>
           </w:p>
         </w:tc>
@@ -6176,7 +6176,7 @@
                 <w:sz w:val="19"/>
                 <w:szCs w:val="19"/>
               </w:rPr>
-              <w:t xml:space="preserve">30 Sep: portfolio company Blitz (quick-commerce fulfilment) kicks off its pre-Series B.</w:t>
+              <w:t xml:space="preserve">30 Sep: portfolio company Blitz (quick-commerce fulfilment) starts its pre-Series B.</w:t>
             </w:r>
           </w:p>
         </w:tc>
@@ -6306,7 +6306,7 @@
                 <w:sz w:val="19"/>
                 <w:szCs w:val="19"/>
               </w:rPr>
-              <w:t xml:space="preserve">8 Oct: Prime invested Rs 32 crore in Desible.ai (B2B AI operating layer).</w:t>
+              <w:t xml:space="preserve">8 Oct: led Desible.ai's Rs 32 crore round (BFSI AI operating layer).</w:t>
             </w:r>
           </w:p>
         </w:tc>
@@ -6725,7 +6725,1218 @@
           <w:sz w:val="30"/>
           <w:szCs w:val="30"/>
         </w:rPr>
-        <w:t xml:space="preserve">8. Assumptions and limitations</w:t>
+        <w:t xml:space="preserve">8. Testing and verification</w:t>
+      </w:r>
+    </w:p>
+    <w:p>
+      <w:pPr>
+        <w:spacing w:after="120" w:before="0"/>
+      </w:pPr>
+      <w:r>
+        <w:rPr>
+          <w:rFonts w:ascii="Calibri" w:cs="Calibri" w:eastAsia="Calibri" w:hAnsi="Calibri"/>
+          <w:sz w:val="21"/>
+          <w:szCs w:val="21"/>
+        </w:rPr>
+        <w:t xml:space="preserve">Two full live runs were made on the production deployment, each followed by an automated end-to-end audit (npm run audit) and a manual review of every email draft. The audit reads the stored run and checks it independently of the pipeline code.</w:t>
+      </w:r>
+    </w:p>
+    <w:tbl>
+      <w:tblPr>
+        <w:tblW w:type="dxa" w:w="9746"/>
+        <w:tblBorders>
+          <w:top w:val="single" w:color="auto" w:sz="4"/>
+          <w:left w:val="single" w:color="auto" w:sz="4"/>
+          <w:bottom w:val="single" w:color="auto" w:sz="4"/>
+          <w:right w:val="single" w:color="auto" w:sz="4"/>
+          <w:insideH w:val="single" w:color="auto" w:sz="4"/>
+          <w:insideV w:val="single" w:color="auto" w:sz="4"/>
+        </w:tblBorders>
+      </w:tblPr>
+      <w:tblGrid>
+        <w:gridCol w:w="4873"/>
+        <w:gridCol w:w="2436"/>
+        <w:gridCol w:w="2437"/>
+      </w:tblGrid>
+      <w:tr>
+        <w:trPr>
+          <w:tblHeader/>
+        </w:trPr>
+        <w:tc>
+          <w:tcPr>
+            <w:tcW w:type="dxa" w:w="4873"/>
+            <w:tcBorders>
+              <w:top w:val="single" w:color="C9D1DE" w:sz="4"/>
+              <w:left w:val="single" w:color="C9D1DE" w:sz="4"/>
+              <w:bottom w:val="single" w:color="C9D1DE" w:sz="4"/>
+              <w:right w:val="single" w:color="C9D1DE" w:sz="4"/>
+            </w:tcBorders>
+            <w:shd w:fill="13294B" w:color="auto" w:val="clear"/>
+            <w:tcMar>
+              <w:top w:type="dxa" w:w="70"/>
+              <w:left w:type="dxa" w:w="100"/>
+              <w:bottom w:type="dxa" w:w="70"/>
+              <w:right w:type="dxa" w:w="100"/>
+            </w:tcMar>
+          </w:tcPr>
+          <w:p>
+            <w:pPr>
+              <w:spacing w:after="30"/>
+            </w:pPr>
+            <w:r>
+              <w:rPr>
+                <w:rFonts w:ascii="Calibri" w:cs="Calibri" w:eastAsia="Calibri" w:hAnsi="Calibri"/>
+                <w:b/>
+                <w:bCs/>
+                <w:color w:val="FFFFFF"/>
+                <w:sz w:val="19"/>
+                <w:szCs w:val="19"/>
+              </w:rPr>
+              <w:t xml:space="preserve">Check</w:t>
+            </w:r>
+          </w:p>
+        </w:tc>
+        <w:tc>
+          <w:tcPr>
+            <w:tcW w:type="dxa" w:w="2436"/>
+            <w:tcBorders>
+              <w:top w:val="single" w:color="C9D1DE" w:sz="4"/>
+              <w:left w:val="single" w:color="C9D1DE" w:sz="4"/>
+              <w:bottom w:val="single" w:color="C9D1DE" w:sz="4"/>
+              <w:right w:val="single" w:color="C9D1DE" w:sz="4"/>
+            </w:tcBorders>
+            <w:shd w:fill="13294B" w:color="auto" w:val="clear"/>
+            <w:tcMar>
+              <w:top w:type="dxa" w:w="70"/>
+              <w:left w:type="dxa" w:w="100"/>
+              <w:bottom w:type="dxa" w:w="70"/>
+              <w:right w:type="dxa" w:w="100"/>
+            </w:tcMar>
+          </w:tcPr>
+          <w:p>
+            <w:pPr>
+              <w:spacing w:after="30"/>
+            </w:pPr>
+            <w:r>
+              <w:rPr>
+                <w:rFonts w:ascii="Calibri" w:cs="Calibri" w:eastAsia="Calibri" w:hAnsi="Calibri"/>
+                <w:b/>
+                <w:bCs/>
+                <w:color w:val="FFFFFF"/>
+                <w:sz w:val="19"/>
+                <w:szCs w:val="19"/>
+              </w:rPr>
+              <w:t xml:space="preserve">Test 1 (run 9)</w:t>
+            </w:r>
+          </w:p>
+        </w:tc>
+        <w:tc>
+          <w:tcPr>
+            <w:tcW w:type="dxa" w:w="2437"/>
+            <w:tcBorders>
+              <w:top w:val="single" w:color="C9D1DE" w:sz="4"/>
+              <w:left w:val="single" w:color="C9D1DE" w:sz="4"/>
+              <w:bottom w:val="single" w:color="C9D1DE" w:sz="4"/>
+              <w:right w:val="single" w:color="C9D1DE" w:sz="4"/>
+            </w:tcBorders>
+            <w:shd w:fill="13294B" w:color="auto" w:val="clear"/>
+            <w:tcMar>
+              <w:top w:type="dxa" w:w="70"/>
+              <w:left w:type="dxa" w:w="100"/>
+              <w:bottom w:type="dxa" w:w="70"/>
+              <w:right w:type="dxa" w:w="100"/>
+            </w:tcMar>
+          </w:tcPr>
+          <w:p>
+            <w:pPr>
+              <w:spacing w:after="30"/>
+            </w:pPr>
+            <w:r>
+              <w:rPr>
+                <w:rFonts w:ascii="Calibri" w:cs="Calibri" w:eastAsia="Calibri" w:hAnsi="Calibri"/>
+                <w:b/>
+                <w:bCs/>
+                <w:color w:val="FFFFFF"/>
+                <w:sz w:val="19"/>
+                <w:szCs w:val="19"/>
+              </w:rPr>
+              <w:t xml:space="preserve">Test 2 (run 10)</w:t>
+            </w:r>
+          </w:p>
+        </w:tc>
+      </w:tr>
+      <w:tr>
+        <w:tc>
+          <w:tcPr>
+            <w:tcW w:type="dxa" w:w="4873"/>
+            <w:tcBorders>
+              <w:top w:val="single" w:color="C9D1DE" w:sz="4"/>
+              <w:left w:val="single" w:color="C9D1DE" w:sz="4"/>
+              <w:bottom w:val="single" w:color="C9D1DE" w:sz="4"/>
+              <w:right w:val="single" w:color="C9D1DE" w:sz="4"/>
+            </w:tcBorders>
+            <w:tcMar>
+              <w:top w:type="dxa" w:w="70"/>
+              <w:left w:type="dxa" w:w="100"/>
+              <w:bottom w:type="dxa" w:w="70"/>
+              <w:right w:type="dxa" w:w="100"/>
+            </w:tcMar>
+          </w:tcPr>
+          <w:p>
+            <w:pPr>
+              <w:spacing w:after="30"/>
+            </w:pPr>
+            <w:r>
+              <w:rPr>
+                <w:rFonts w:ascii="Calibri" w:cs="Calibri" w:eastAsia="Calibri" w:hAnsi="Calibri"/>
+                <w:b w:val="false"/>
+                <w:bCs w:val="false"/>
+                <w:sz w:val="19"/>
+                <w:szCs w:val="19"/>
+              </w:rPr>
+              <w:t xml:space="preserve">All 50 VCs checked, notes fingerprint unchanged</w:t>
+            </w:r>
+          </w:p>
+        </w:tc>
+        <w:tc>
+          <w:tcPr>
+            <w:tcW w:type="dxa" w:w="2436"/>
+            <w:tcBorders>
+              <w:top w:val="single" w:color="C9D1DE" w:sz="4"/>
+              <w:left w:val="single" w:color="C9D1DE" w:sz="4"/>
+              <w:bottom w:val="single" w:color="C9D1DE" w:sz="4"/>
+              <w:right w:val="single" w:color="C9D1DE" w:sz="4"/>
+            </w:tcBorders>
+            <w:tcMar>
+              <w:top w:type="dxa" w:w="70"/>
+              <w:left w:type="dxa" w:w="100"/>
+              <w:bottom w:type="dxa" w:w="70"/>
+              <w:right w:type="dxa" w:w="100"/>
+            </w:tcMar>
+          </w:tcPr>
+          <w:p>
+            <w:pPr>
+              <w:spacing w:after="30"/>
+            </w:pPr>
+            <w:r>
+              <w:rPr>
+                <w:rFonts w:ascii="Calibri" w:cs="Calibri" w:eastAsia="Calibri" w:hAnsi="Calibri"/>
+                <w:b w:val="false"/>
+                <w:bCs w:val="false"/>
+                <w:sz w:val="19"/>
+                <w:szCs w:val="19"/>
+              </w:rPr>
+              <w:t xml:space="preserve">✓ 3 min 19 s, 259 signals</w:t>
+            </w:r>
+          </w:p>
+        </w:tc>
+        <w:tc>
+          <w:tcPr>
+            <w:tcW w:type="dxa" w:w="2437"/>
+            <w:tcBorders>
+              <w:top w:val="single" w:color="C9D1DE" w:sz="4"/>
+              <w:left w:val="single" w:color="C9D1DE" w:sz="4"/>
+              <w:bottom w:val="single" w:color="C9D1DE" w:sz="4"/>
+              <w:right w:val="single" w:color="C9D1DE" w:sz="4"/>
+            </w:tcBorders>
+            <w:tcMar>
+              <w:top w:type="dxa" w:w="70"/>
+              <w:left w:type="dxa" w:w="100"/>
+              <w:bottom w:type="dxa" w:w="70"/>
+              <w:right w:type="dxa" w:w="100"/>
+            </w:tcMar>
+          </w:tcPr>
+          <w:p>
+            <w:pPr>
+              <w:spacing w:after="30"/>
+            </w:pPr>
+            <w:r>
+              <w:rPr>
+                <w:rFonts w:ascii="Calibri" w:cs="Calibri" w:eastAsia="Calibri" w:hAnsi="Calibri"/>
+                <w:b w:val="false"/>
+                <w:bCs w:val="false"/>
+                <w:sz w:val="19"/>
+                <w:szCs w:val="19"/>
+              </w:rPr>
+              <w:t xml:space="preserve">✓ 3 min 17 s, 237 signals</w:t>
+            </w:r>
+          </w:p>
+        </w:tc>
+      </w:tr>
+      <w:tr>
+        <w:tc>
+          <w:tcPr>
+            <w:tcW w:type="dxa" w:w="4873"/>
+            <w:tcBorders>
+              <w:top w:val="single" w:color="C9D1DE" w:sz="4"/>
+              <w:left w:val="single" w:color="C9D1DE" w:sz="4"/>
+              <w:bottom w:val="single" w:color="C9D1DE" w:sz="4"/>
+              <w:right w:val="single" w:color="C9D1DE" w:sz="4"/>
+            </w:tcBorders>
+            <w:tcMar>
+              <w:top w:type="dxa" w:w="70"/>
+              <w:left w:type="dxa" w:w="100"/>
+              <w:bottom w:type="dxa" w:w="70"/>
+              <w:right w:type="dxa" w:w="100"/>
+            </w:tcMar>
+          </w:tcPr>
+          <w:p>
+            <w:pPr>
+              <w:spacing w:after="30"/>
+            </w:pPr>
+            <w:r>
+              <w:rPr>
+                <w:rFonts w:ascii="Calibri" w:cs="Calibri" w:eastAsia="Calibri" w:hAnsi="Calibri"/>
+                <w:b w:val="false"/>
+                <w:bCs w:val="false"/>
+                <w:sz w:val="19"/>
+                <w:szCs w:val="19"/>
+              </w:rPr>
+              <w:t xml:space="preserve">Every signal has a real link and a date within 30 days</w:t>
+            </w:r>
+          </w:p>
+        </w:tc>
+        <w:tc>
+          <w:tcPr>
+            <w:tcW w:type="dxa" w:w="2436"/>
+            <w:tcBorders>
+              <w:top w:val="single" w:color="C9D1DE" w:sz="4"/>
+              <w:left w:val="single" w:color="C9D1DE" w:sz="4"/>
+              <w:bottom w:val="single" w:color="C9D1DE" w:sz="4"/>
+              <w:right w:val="single" w:color="C9D1DE" w:sz="4"/>
+            </w:tcBorders>
+            <w:tcMar>
+              <w:top w:type="dxa" w:w="70"/>
+              <w:left w:type="dxa" w:w="100"/>
+              <w:bottom w:type="dxa" w:w="70"/>
+              <w:right w:type="dxa" w:w="100"/>
+            </w:tcMar>
+          </w:tcPr>
+          <w:p>
+            <w:pPr>
+              <w:spacing w:after="30"/>
+            </w:pPr>
+            <w:r>
+              <w:rPr>
+                <w:rFonts w:ascii="Calibri" w:cs="Calibri" w:eastAsia="Calibri" w:hAnsi="Calibri"/>
+                <w:b w:val="false"/>
+                <w:bCs w:val="false"/>
+                <w:sz w:val="19"/>
+                <w:szCs w:val="19"/>
+              </w:rPr>
+              <w:t xml:space="preserve">✓</w:t>
+            </w:r>
+          </w:p>
+        </w:tc>
+        <w:tc>
+          <w:tcPr>
+            <w:tcW w:type="dxa" w:w="2437"/>
+            <w:tcBorders>
+              <w:top w:val="single" w:color="C9D1DE" w:sz="4"/>
+              <w:left w:val="single" w:color="C9D1DE" w:sz="4"/>
+              <w:bottom w:val="single" w:color="C9D1DE" w:sz="4"/>
+              <w:right w:val="single" w:color="C9D1DE" w:sz="4"/>
+            </w:tcBorders>
+            <w:tcMar>
+              <w:top w:type="dxa" w:w="70"/>
+              <w:left w:type="dxa" w:w="100"/>
+              <w:bottom w:type="dxa" w:w="70"/>
+              <w:right w:type="dxa" w:w="100"/>
+            </w:tcMar>
+          </w:tcPr>
+          <w:p>
+            <w:pPr>
+              <w:spacing w:after="30"/>
+            </w:pPr>
+            <w:r>
+              <w:rPr>
+                <w:rFonts w:ascii="Calibri" w:cs="Calibri" w:eastAsia="Calibri" w:hAnsi="Calibri"/>
+                <w:b w:val="false"/>
+                <w:bCs w:val="false"/>
+                <w:sz w:val="19"/>
+                <w:szCs w:val="19"/>
+              </w:rPr>
+              <w:t xml:space="preserve">✓</w:t>
+            </w:r>
+          </w:p>
+        </w:tc>
+      </w:tr>
+      <w:tr>
+        <w:tc>
+          <w:tcPr>
+            <w:tcW w:type="dxa" w:w="4873"/>
+            <w:tcBorders>
+              <w:top w:val="single" w:color="C9D1DE" w:sz="4"/>
+              <w:left w:val="single" w:color="C9D1DE" w:sz="4"/>
+              <w:bottom w:val="single" w:color="C9D1DE" w:sz="4"/>
+              <w:right w:val="single" w:color="C9D1DE" w:sz="4"/>
+            </w:tcBorders>
+            <w:tcMar>
+              <w:top w:type="dxa" w:w="70"/>
+              <w:left w:type="dxa" w:w="100"/>
+              <w:bottom w:type="dxa" w:w="70"/>
+              <w:right w:type="dxa" w:w="100"/>
+            </w:tcMar>
+          </w:tcPr>
+          <w:p>
+            <w:pPr>
+              <w:spacing w:after="30"/>
+            </w:pPr>
+            <w:r>
+              <w:rPr>
+                <w:rFonts w:ascii="Calibri" w:cs="Calibri" w:eastAsia="Calibri" w:hAnsi="Calibri"/>
+                <w:b w:val="false"/>
+                <w:bCs w:val="false"/>
+                <w:sz w:val="19"/>
+                <w:szCs w:val="19"/>
+              </w:rPr>
+              <w:t xml:space="preserve">No investor-database pages (Tracxn, Crunchbase…)</w:t>
+            </w:r>
+          </w:p>
+        </w:tc>
+        <w:tc>
+          <w:tcPr>
+            <w:tcW w:type="dxa" w:w="2436"/>
+            <w:tcBorders>
+              <w:top w:val="single" w:color="C9D1DE" w:sz="4"/>
+              <w:left w:val="single" w:color="C9D1DE" w:sz="4"/>
+              <w:bottom w:val="single" w:color="C9D1DE" w:sz="4"/>
+              <w:right w:val="single" w:color="C9D1DE" w:sz="4"/>
+            </w:tcBorders>
+            <w:tcMar>
+              <w:top w:type="dxa" w:w="70"/>
+              <w:left w:type="dxa" w:w="100"/>
+              <w:bottom w:type="dxa" w:w="70"/>
+              <w:right w:type="dxa" w:w="100"/>
+            </w:tcMar>
+          </w:tcPr>
+          <w:p>
+            <w:pPr>
+              <w:spacing w:after="30"/>
+            </w:pPr>
+            <w:r>
+              <w:rPr>
+                <w:rFonts w:ascii="Calibri" w:cs="Calibri" w:eastAsia="Calibri" w:hAnsi="Calibri"/>
+                <w:b w:val="false"/>
+                <w:bCs w:val="false"/>
+                <w:sz w:val="19"/>
+                <w:szCs w:val="19"/>
+              </w:rPr>
+              <w:t xml:space="preserve">✓</w:t>
+            </w:r>
+          </w:p>
+        </w:tc>
+        <w:tc>
+          <w:tcPr>
+            <w:tcW w:type="dxa" w:w="2437"/>
+            <w:tcBorders>
+              <w:top w:val="single" w:color="C9D1DE" w:sz="4"/>
+              <w:left w:val="single" w:color="C9D1DE" w:sz="4"/>
+              <w:bottom w:val="single" w:color="C9D1DE" w:sz="4"/>
+              <w:right w:val="single" w:color="C9D1DE" w:sz="4"/>
+            </w:tcBorders>
+            <w:tcMar>
+              <w:top w:type="dxa" w:w="70"/>
+              <w:left w:type="dxa" w:w="100"/>
+              <w:bottom w:type="dxa" w:w="70"/>
+              <w:right w:type="dxa" w:w="100"/>
+            </w:tcMar>
+          </w:tcPr>
+          <w:p>
+            <w:pPr>
+              <w:spacing w:after="30"/>
+            </w:pPr>
+            <w:r>
+              <w:rPr>
+                <w:rFonts w:ascii="Calibri" w:cs="Calibri" w:eastAsia="Calibri" w:hAnsi="Calibri"/>
+                <w:b w:val="false"/>
+                <w:bCs w:val="false"/>
+                <w:sz w:val="19"/>
+                <w:szCs w:val="19"/>
+              </w:rPr>
+              <w:t xml:space="preserve">✓</w:t>
+            </w:r>
+          </w:p>
+        </w:tc>
+      </w:tr>
+      <w:tr>
+        <w:tc>
+          <w:tcPr>
+            <w:tcW w:type="dxa" w:w="4873"/>
+            <w:tcBorders>
+              <w:top w:val="single" w:color="C9D1DE" w:sz="4"/>
+              <w:left w:val="single" w:color="C9D1DE" w:sz="4"/>
+              <w:bottom w:val="single" w:color="C9D1DE" w:sz="4"/>
+              <w:right w:val="single" w:color="C9D1DE" w:sz="4"/>
+            </w:tcBorders>
+            <w:tcMar>
+              <w:top w:type="dxa" w:w="70"/>
+              <w:left w:type="dxa" w:w="100"/>
+              <w:bottom w:type="dxa" w:w="70"/>
+              <w:right w:type="dxa" w:w="100"/>
+            </w:tcMar>
+          </w:tcPr>
+          <w:p>
+            <w:pPr>
+              <w:spacing w:after="30"/>
+            </w:pPr>
+            <w:r>
+              <w:rPr>
+                <w:rFonts w:ascii="Calibri" w:cs="Calibri" w:eastAsia="Calibri" w:hAnsi="Calibri"/>
+                <w:b w:val="false"/>
+                <w:bCs w:val="false"/>
+                <w:sz w:val="19"/>
+                <w:szCs w:val="19"/>
+              </w:rPr>
+              <w:t xml:space="preserve">Score recomputed from stored evidence = stored score (all 50)</w:t>
+            </w:r>
+          </w:p>
+        </w:tc>
+        <w:tc>
+          <w:tcPr>
+            <w:tcW w:type="dxa" w:w="2436"/>
+            <w:tcBorders>
+              <w:top w:val="single" w:color="C9D1DE" w:sz="4"/>
+              <w:left w:val="single" w:color="C9D1DE" w:sz="4"/>
+              <w:bottom w:val="single" w:color="C9D1DE" w:sz="4"/>
+              <w:right w:val="single" w:color="C9D1DE" w:sz="4"/>
+            </w:tcBorders>
+            <w:tcMar>
+              <w:top w:type="dxa" w:w="70"/>
+              <w:left w:type="dxa" w:w="100"/>
+              <w:bottom w:type="dxa" w:w="70"/>
+              <w:right w:type="dxa" w:w="100"/>
+            </w:tcMar>
+          </w:tcPr>
+          <w:p>
+            <w:pPr>
+              <w:spacing w:after="30"/>
+            </w:pPr>
+            <w:r>
+              <w:rPr>
+                <w:rFonts w:ascii="Calibri" w:cs="Calibri" w:eastAsia="Calibri" w:hAnsi="Calibri"/>
+                <w:b w:val="false"/>
+                <w:bCs w:val="false"/>
+                <w:sz w:val="19"/>
+                <w:szCs w:val="19"/>
+              </w:rPr>
+              <w:t xml:space="preserve">✓</w:t>
+            </w:r>
+          </w:p>
+        </w:tc>
+        <w:tc>
+          <w:tcPr>
+            <w:tcW w:type="dxa" w:w="2437"/>
+            <w:tcBorders>
+              <w:top w:val="single" w:color="C9D1DE" w:sz="4"/>
+              <w:left w:val="single" w:color="C9D1DE" w:sz="4"/>
+              <w:bottom w:val="single" w:color="C9D1DE" w:sz="4"/>
+              <w:right w:val="single" w:color="C9D1DE" w:sz="4"/>
+            </w:tcBorders>
+            <w:tcMar>
+              <w:top w:type="dxa" w:w="70"/>
+              <w:left w:type="dxa" w:w="100"/>
+              <w:bottom w:type="dxa" w:w="70"/>
+              <w:right w:type="dxa" w:w="100"/>
+            </w:tcMar>
+          </w:tcPr>
+          <w:p>
+            <w:pPr>
+              <w:spacing w:after="30"/>
+            </w:pPr>
+            <w:r>
+              <w:rPr>
+                <w:rFonts w:ascii="Calibri" w:cs="Calibri" w:eastAsia="Calibri" w:hAnsi="Calibri"/>
+                <w:b w:val="false"/>
+                <w:bCs w:val="false"/>
+                <w:sz w:val="19"/>
+                <w:szCs w:val="19"/>
+              </w:rPr>
+              <w:t xml:space="preserve">✓</w:t>
+            </w:r>
+          </w:p>
+        </w:tc>
+      </w:tr>
+      <w:tr>
+        <w:tc>
+          <w:tcPr>
+            <w:tcW w:type="dxa" w:w="4873"/>
+            <w:tcBorders>
+              <w:top w:val="single" w:color="C9D1DE" w:sz="4"/>
+              <w:left w:val="single" w:color="C9D1DE" w:sz="4"/>
+              <w:bottom w:val="single" w:color="C9D1DE" w:sz="4"/>
+              <w:right w:val="single" w:color="C9D1DE" w:sz="4"/>
+            </w:tcBorders>
+            <w:tcMar>
+              <w:top w:type="dxa" w:w="70"/>
+              <w:left w:type="dxa" w:w="100"/>
+              <w:bottom w:type="dxa" w:w="70"/>
+              <w:right w:type="dxa" w:w="100"/>
+            </w:tcMar>
+          </w:tcPr>
+          <w:p>
+            <w:pPr>
+              <w:spacing w:after="30"/>
+            </w:pPr>
+            <w:r>
+              <w:rPr>
+                <w:rFonts w:ascii="Calibri" w:cs="Calibri" w:eastAsia="Calibri" w:hAnsi="Calibri"/>
+                <w:b w:val="false"/>
+                <w:bCs w:val="false"/>
+                <w:sz w:val="19"/>
+                <w:szCs w:val="19"/>
+              </w:rPr>
+              <w:t xml:space="preserve">Action recomputed from the rules = stored action (all 50)</w:t>
+            </w:r>
+          </w:p>
+        </w:tc>
+        <w:tc>
+          <w:tcPr>
+            <w:tcW w:type="dxa" w:w="2436"/>
+            <w:tcBorders>
+              <w:top w:val="single" w:color="C9D1DE" w:sz="4"/>
+              <w:left w:val="single" w:color="C9D1DE" w:sz="4"/>
+              <w:bottom w:val="single" w:color="C9D1DE" w:sz="4"/>
+              <w:right w:val="single" w:color="C9D1DE" w:sz="4"/>
+            </w:tcBorders>
+            <w:tcMar>
+              <w:top w:type="dxa" w:w="70"/>
+              <w:left w:type="dxa" w:w="100"/>
+              <w:bottom w:type="dxa" w:w="70"/>
+              <w:right w:type="dxa" w:w="100"/>
+            </w:tcMar>
+          </w:tcPr>
+          <w:p>
+            <w:pPr>
+              <w:spacing w:after="30"/>
+            </w:pPr>
+            <w:r>
+              <w:rPr>
+                <w:rFonts w:ascii="Calibri" w:cs="Calibri" w:eastAsia="Calibri" w:hAnsi="Calibri"/>
+                <w:b w:val="false"/>
+                <w:bCs w:val="false"/>
+                <w:sz w:val="19"/>
+                <w:szCs w:val="19"/>
+              </w:rPr>
+              <w:t xml:space="preserve">✓</w:t>
+            </w:r>
+          </w:p>
+        </w:tc>
+        <w:tc>
+          <w:tcPr>
+            <w:tcW w:type="dxa" w:w="2437"/>
+            <w:tcBorders>
+              <w:top w:val="single" w:color="C9D1DE" w:sz="4"/>
+              <w:left w:val="single" w:color="C9D1DE" w:sz="4"/>
+              <w:bottom w:val="single" w:color="C9D1DE" w:sz="4"/>
+              <w:right w:val="single" w:color="C9D1DE" w:sz="4"/>
+            </w:tcBorders>
+            <w:tcMar>
+              <w:top w:type="dxa" w:w="70"/>
+              <w:left w:type="dxa" w:w="100"/>
+              <w:bottom w:type="dxa" w:w="70"/>
+              <w:right w:type="dxa" w:w="100"/>
+            </w:tcMar>
+          </w:tcPr>
+          <w:p>
+            <w:pPr>
+              <w:spacing w:after="30"/>
+            </w:pPr>
+            <w:r>
+              <w:rPr>
+                <w:rFonts w:ascii="Calibri" w:cs="Calibri" w:eastAsia="Calibri" w:hAnsi="Calibri"/>
+                <w:b w:val="false"/>
+                <w:bCs w:val="false"/>
+                <w:sz w:val="19"/>
+                <w:szCs w:val="19"/>
+              </w:rPr>
+              <w:t xml:space="preserve">✓</w:t>
+            </w:r>
+          </w:p>
+        </w:tc>
+      </w:tr>
+      <w:tr>
+        <w:tc>
+          <w:tcPr>
+            <w:tcW w:type="dxa" w:w="4873"/>
+            <w:tcBorders>
+              <w:top w:val="single" w:color="C9D1DE" w:sz="4"/>
+              <w:left w:val="single" w:color="C9D1DE" w:sz="4"/>
+              <w:bottom w:val="single" w:color="C9D1DE" w:sz="4"/>
+              <w:right w:val="single" w:color="C9D1DE" w:sz="4"/>
+            </w:tcBorders>
+            <w:tcMar>
+              <w:top w:type="dxa" w:w="70"/>
+              <w:left w:type="dxa" w:w="100"/>
+              <w:bottom w:type="dxa" w:w="70"/>
+              <w:right w:type="dxa" w:w="100"/>
+            </w:tcMar>
+          </w:tcPr>
+          <w:p>
+            <w:pPr>
+              <w:spacing w:after="30"/>
+            </w:pPr>
+            <w:r>
+              <w:rPr>
+                <w:rFonts w:ascii="Calibri" w:cs="Calibri" w:eastAsia="Calibri" w:hAnsi="Calibri"/>
+                <w:b w:val="false"/>
+                <w:bCs w:val="false"/>
+                <w:sz w:val="19"/>
+                <w:szCs w:val="19"/>
+              </w:rPr>
+              <w:t xml:space="preserve">Signal columns in vcs match the run</w:t>
+            </w:r>
+          </w:p>
+        </w:tc>
+        <w:tc>
+          <w:tcPr>
+            <w:tcW w:type="dxa" w:w="2436"/>
+            <w:tcBorders>
+              <w:top w:val="single" w:color="C9D1DE" w:sz="4"/>
+              <w:left w:val="single" w:color="C9D1DE" w:sz="4"/>
+              <w:bottom w:val="single" w:color="C9D1DE" w:sz="4"/>
+              <w:right w:val="single" w:color="C9D1DE" w:sz="4"/>
+            </w:tcBorders>
+            <w:tcMar>
+              <w:top w:type="dxa" w:w="70"/>
+              <w:left w:type="dxa" w:w="100"/>
+              <w:bottom w:type="dxa" w:w="70"/>
+              <w:right w:type="dxa" w:w="100"/>
+            </w:tcMar>
+          </w:tcPr>
+          <w:p>
+            <w:pPr>
+              <w:spacing w:after="30"/>
+            </w:pPr>
+            <w:r>
+              <w:rPr>
+                <w:rFonts w:ascii="Calibri" w:cs="Calibri" w:eastAsia="Calibri" w:hAnsi="Calibri"/>
+                <w:b w:val="false"/>
+                <w:bCs w:val="false"/>
+                <w:sz w:val="19"/>
+                <w:szCs w:val="19"/>
+              </w:rPr>
+              <w:t xml:space="preserve">✓</w:t>
+            </w:r>
+          </w:p>
+        </w:tc>
+        <w:tc>
+          <w:tcPr>
+            <w:tcW w:type="dxa" w:w="2437"/>
+            <w:tcBorders>
+              <w:top w:val="single" w:color="C9D1DE" w:sz="4"/>
+              <w:left w:val="single" w:color="C9D1DE" w:sz="4"/>
+              <w:bottom w:val="single" w:color="C9D1DE" w:sz="4"/>
+              <w:right w:val="single" w:color="C9D1DE" w:sz="4"/>
+            </w:tcBorders>
+            <w:tcMar>
+              <w:top w:type="dxa" w:w="70"/>
+              <w:left w:type="dxa" w:w="100"/>
+              <w:bottom w:type="dxa" w:w="70"/>
+              <w:right w:type="dxa" w:w="100"/>
+            </w:tcMar>
+          </w:tcPr>
+          <w:p>
+            <w:pPr>
+              <w:spacing w:after="30"/>
+            </w:pPr>
+            <w:r>
+              <w:rPr>
+                <w:rFonts w:ascii="Calibri" w:cs="Calibri" w:eastAsia="Calibri" w:hAnsi="Calibri"/>
+                <w:b w:val="false"/>
+                <w:bCs w:val="false"/>
+                <w:sz w:val="19"/>
+                <w:szCs w:val="19"/>
+              </w:rPr>
+              <w:t xml:space="preserve">✓</w:t>
+            </w:r>
+          </w:p>
+        </w:tc>
+      </w:tr>
+      <w:tr>
+        <w:tc>
+          <w:tcPr>
+            <w:tcW w:type="dxa" w:w="4873"/>
+            <w:tcBorders>
+              <w:top w:val="single" w:color="C9D1DE" w:sz="4"/>
+              <w:left w:val="single" w:color="C9D1DE" w:sz="4"/>
+              <w:bottom w:val="single" w:color="C9D1DE" w:sz="4"/>
+              <w:right w:val="single" w:color="C9D1DE" w:sz="4"/>
+            </w:tcBorders>
+            <w:tcMar>
+              <w:top w:type="dxa" w:w="70"/>
+              <w:left w:type="dxa" w:w="100"/>
+              <w:bottom w:type="dxa" w:w="70"/>
+              <w:right w:type="dxa" w:w="100"/>
+            </w:tcMar>
+          </w:tcPr>
+          <w:p>
+            <w:pPr>
+              <w:spacing w:after="30"/>
+            </w:pPr>
+            <w:r>
+              <w:rPr>
+                <w:rFonts w:ascii="Calibri" w:cs="Calibri" w:eastAsia="Calibri" w:hAnsi="Calibri"/>
+                <w:b w:val="false"/>
+                <w:bCs w:val="false"/>
+                <w:sz w:val="19"/>
+                <w:szCs w:val="19"/>
+              </w:rPr>
+              <w:t xml:space="preserve">A draft exists exactly for Reach out / Nudge VCs</w:t>
+            </w:r>
+          </w:p>
+        </w:tc>
+        <w:tc>
+          <w:tcPr>
+            <w:tcW w:type="dxa" w:w="2436"/>
+            <w:tcBorders>
+              <w:top w:val="single" w:color="C9D1DE" w:sz="4"/>
+              <w:left w:val="single" w:color="C9D1DE" w:sz="4"/>
+              <w:bottom w:val="single" w:color="C9D1DE" w:sz="4"/>
+              <w:right w:val="single" w:color="C9D1DE" w:sz="4"/>
+            </w:tcBorders>
+            <w:tcMar>
+              <w:top w:type="dxa" w:w="70"/>
+              <w:left w:type="dxa" w:w="100"/>
+              <w:bottom w:type="dxa" w:w="70"/>
+              <w:right w:type="dxa" w:w="100"/>
+            </w:tcMar>
+          </w:tcPr>
+          <w:p>
+            <w:pPr>
+              <w:spacing w:after="30"/>
+            </w:pPr>
+            <w:r>
+              <w:rPr>
+                <w:rFonts w:ascii="Calibri" w:cs="Calibri" w:eastAsia="Calibri" w:hAnsi="Calibri"/>
+                <w:b w:val="false"/>
+                <w:bCs w:val="false"/>
+                <w:sz w:val="19"/>
+                <w:szCs w:val="19"/>
+              </w:rPr>
+              <w:t xml:space="preserve">✓</w:t>
+            </w:r>
+          </w:p>
+        </w:tc>
+        <w:tc>
+          <w:tcPr>
+            <w:tcW w:type="dxa" w:w="2437"/>
+            <w:tcBorders>
+              <w:top w:val="single" w:color="C9D1DE" w:sz="4"/>
+              <w:left w:val="single" w:color="C9D1DE" w:sz="4"/>
+              <w:bottom w:val="single" w:color="C9D1DE" w:sz="4"/>
+              <w:right w:val="single" w:color="C9D1DE" w:sz="4"/>
+            </w:tcBorders>
+            <w:tcMar>
+              <w:top w:type="dxa" w:w="70"/>
+              <w:left w:type="dxa" w:w="100"/>
+              <w:bottom w:type="dxa" w:w="70"/>
+              <w:right w:type="dxa" w:w="100"/>
+            </w:tcMar>
+          </w:tcPr>
+          <w:p>
+            <w:pPr>
+              <w:spacing w:after="30"/>
+            </w:pPr>
+            <w:r>
+              <w:rPr>
+                <w:rFonts w:ascii="Calibri" w:cs="Calibri" w:eastAsia="Calibri" w:hAnsi="Calibri"/>
+                <w:b w:val="false"/>
+                <w:bCs w:val="false"/>
+                <w:sz w:val="19"/>
+                <w:szCs w:val="19"/>
+              </w:rPr>
+              <w:t xml:space="preserve">✓</w:t>
+            </w:r>
+          </w:p>
+        </w:tc>
+      </w:tr>
+      <w:tr>
+        <w:tc>
+          <w:tcPr>
+            <w:tcW w:type="dxa" w:w="4873"/>
+            <w:tcBorders>
+              <w:top w:val="single" w:color="C9D1DE" w:sz="4"/>
+              <w:left w:val="single" w:color="C9D1DE" w:sz="4"/>
+              <w:bottom w:val="single" w:color="C9D1DE" w:sz="4"/>
+              <w:right w:val="single" w:color="C9D1DE" w:sz="4"/>
+            </w:tcBorders>
+            <w:tcMar>
+              <w:top w:type="dxa" w:w="70"/>
+              <w:left w:type="dxa" w:w="100"/>
+              <w:bottom w:type="dxa" w:w="70"/>
+              <w:right w:type="dxa" w:w="100"/>
+            </w:tcMar>
+          </w:tcPr>
+          <w:p>
+            <w:pPr>
+              <w:spacing w:after="30"/>
+            </w:pPr>
+            <w:r>
+              <w:rPr>
+                <w:rFonts w:ascii="Calibri" w:cs="Calibri" w:eastAsia="Calibri" w:hAnsi="Calibri"/>
+                <w:b w:val="false"/>
+                <w:bCs w:val="false"/>
+                <w:sz w:val="19"/>
+                <w:szCs w:val="19"/>
+              </w:rPr>
+              <w:t xml:space="preserve">Every draft opens with that VC’s own recent signal</w:t>
+            </w:r>
+          </w:p>
+        </w:tc>
+        <w:tc>
+          <w:tcPr>
+            <w:tcW w:type="dxa" w:w="2436"/>
+            <w:tcBorders>
+              <w:top w:val="single" w:color="C9D1DE" w:sz="4"/>
+              <w:left w:val="single" w:color="C9D1DE" w:sz="4"/>
+              <w:bottom w:val="single" w:color="C9D1DE" w:sz="4"/>
+              <w:right w:val="single" w:color="C9D1DE" w:sz="4"/>
+            </w:tcBorders>
+            <w:tcMar>
+              <w:top w:type="dxa" w:w="70"/>
+              <w:left w:type="dxa" w:w="100"/>
+              <w:bottom w:type="dxa" w:w="70"/>
+              <w:right w:type="dxa" w:w="100"/>
+            </w:tcMar>
+          </w:tcPr>
+          <w:p>
+            <w:pPr>
+              <w:spacing w:after="30"/>
+            </w:pPr>
+            <w:r>
+              <w:rPr>
+                <w:rFonts w:ascii="Calibri" w:cs="Calibri" w:eastAsia="Calibri" w:hAnsi="Calibri"/>
+                <w:b w:val="false"/>
+                <w:bCs w:val="false"/>
+                <w:sz w:val="19"/>
+                <w:szCs w:val="19"/>
+              </w:rPr>
+              <w:t xml:space="preserve">✗ 1 draft (fixed, see below)</w:t>
+            </w:r>
+          </w:p>
+        </w:tc>
+        <w:tc>
+          <w:tcPr>
+            <w:tcW w:type="dxa" w:w="2437"/>
+            <w:tcBorders>
+              <w:top w:val="single" w:color="C9D1DE" w:sz="4"/>
+              <w:left w:val="single" w:color="C9D1DE" w:sz="4"/>
+              <w:bottom w:val="single" w:color="C9D1DE" w:sz="4"/>
+              <w:right w:val="single" w:color="C9D1DE" w:sz="4"/>
+            </w:tcBorders>
+            <w:tcMar>
+              <w:top w:type="dxa" w:w="70"/>
+              <w:left w:type="dxa" w:w="100"/>
+              <w:bottom w:type="dxa" w:w="70"/>
+              <w:right w:type="dxa" w:w="100"/>
+            </w:tcMar>
+          </w:tcPr>
+          <w:p>
+            <w:pPr>
+              <w:spacing w:after="30"/>
+            </w:pPr>
+            <w:r>
+              <w:rPr>
+                <w:rFonts w:ascii="Calibri" w:cs="Calibri" w:eastAsia="Calibri" w:hAnsi="Calibri"/>
+                <w:b w:val="false"/>
+                <w:bCs w:val="false"/>
+                <w:sz w:val="19"/>
+                <w:szCs w:val="19"/>
+              </w:rPr>
+              <w:t xml:space="preserve">✓ 8 of 8</w:t>
+            </w:r>
+          </w:p>
+        </w:tc>
+      </w:tr>
+      <w:tr>
+        <w:tc>
+          <w:tcPr>
+            <w:tcW w:type="dxa" w:w="4873"/>
+            <w:tcBorders>
+              <w:top w:val="single" w:color="C9D1DE" w:sz="4"/>
+              <w:left w:val="single" w:color="C9D1DE" w:sz="4"/>
+              <w:bottom w:val="single" w:color="C9D1DE" w:sz="4"/>
+              <w:right w:val="single" w:color="C9D1DE" w:sz="4"/>
+            </w:tcBorders>
+            <w:tcMar>
+              <w:top w:type="dxa" w:w="70"/>
+              <w:left w:type="dxa" w:w="100"/>
+              <w:bottom w:type="dxa" w:w="70"/>
+              <w:right w:type="dxa" w:w="100"/>
+            </w:tcMar>
+          </w:tcPr>
+          <w:p>
+            <w:pPr>
+              <w:spacing w:after="30"/>
+            </w:pPr>
+            <w:r>
+              <w:rPr>
+                <w:rFonts w:ascii="Calibri" w:cs="Calibri" w:eastAsia="Calibri" w:hAnsi="Calibri"/>
+                <w:b w:val="false"/>
+                <w:bCs w:val="false"/>
+                <w:sz w:val="19"/>
+                <w:szCs w:val="19"/>
+              </w:rPr>
+              <w:t xml:space="preserve">Greeting, sign-off, length, first email vs nudge</w:t>
+            </w:r>
+          </w:p>
+        </w:tc>
+        <w:tc>
+          <w:tcPr>
+            <w:tcW w:type="dxa" w:w="2436"/>
+            <w:tcBorders>
+              <w:top w:val="single" w:color="C9D1DE" w:sz="4"/>
+              <w:left w:val="single" w:color="C9D1DE" w:sz="4"/>
+              <w:bottom w:val="single" w:color="C9D1DE" w:sz="4"/>
+              <w:right w:val="single" w:color="C9D1DE" w:sz="4"/>
+            </w:tcBorders>
+            <w:tcMar>
+              <w:top w:type="dxa" w:w="70"/>
+              <w:left w:type="dxa" w:w="100"/>
+              <w:bottom w:type="dxa" w:w="70"/>
+              <w:right w:type="dxa" w:w="100"/>
+            </w:tcMar>
+          </w:tcPr>
+          <w:p>
+            <w:pPr>
+              <w:spacing w:after="30"/>
+            </w:pPr>
+            <w:r>
+              <w:rPr>
+                <w:rFonts w:ascii="Calibri" w:cs="Calibri" w:eastAsia="Calibri" w:hAnsi="Calibri"/>
+                <w:b w:val="false"/>
+                <w:bCs w:val="false"/>
+                <w:sz w:val="19"/>
+                <w:szCs w:val="19"/>
+              </w:rPr>
+              <w:t xml:space="preserve">✓</w:t>
+            </w:r>
+          </w:p>
+        </w:tc>
+        <w:tc>
+          <w:tcPr>
+            <w:tcW w:type="dxa" w:w="2437"/>
+            <w:tcBorders>
+              <w:top w:val="single" w:color="C9D1DE" w:sz="4"/>
+              <w:left w:val="single" w:color="C9D1DE" w:sz="4"/>
+              <w:bottom w:val="single" w:color="C9D1DE" w:sz="4"/>
+              <w:right w:val="single" w:color="C9D1DE" w:sz="4"/>
+            </w:tcBorders>
+            <w:tcMar>
+              <w:top w:type="dxa" w:w="70"/>
+              <w:left w:type="dxa" w:w="100"/>
+              <w:bottom w:type="dxa" w:w="70"/>
+              <w:right w:type="dxa" w:w="100"/>
+            </w:tcMar>
+          </w:tcPr>
+          <w:p>
+            <w:pPr>
+              <w:spacing w:after="30"/>
+            </w:pPr>
+            <w:r>
+              <w:rPr>
+                <w:rFonts w:ascii="Calibri" w:cs="Calibri" w:eastAsia="Calibri" w:hAnsi="Calibri"/>
+                <w:b w:val="false"/>
+                <w:bCs w:val="false"/>
+                <w:sz w:val="19"/>
+                <w:szCs w:val="19"/>
+              </w:rPr>
+              <w:t xml:space="preserve">✓</w:t>
+            </w:r>
+          </w:p>
+        </w:tc>
+      </w:tr>
+    </w:tbl>
+    <w:p>
+      <w:pPr>
+        <w:spacing w:after="120" w:before="120"/>
+      </w:pPr>
+      <w:r>
+        <w:rPr>
+          <w:rFonts w:ascii="Calibri" w:cs="Calibri" w:eastAsia="Calibri" w:hAnsi="Calibri"/>
+          <w:b/>
+          <w:bCs/>
+          <w:sz w:val="21"/>
+          <w:szCs w:val="21"/>
+        </w:rPr>
+        <w:t xml:space="preserve">Bug found and fixed: </w:t>
+      </w:r>
+      <w:r>
+        <w:rPr>
+          <w:rFonts w:ascii="Calibri" w:cs="Calibri" w:eastAsia="Calibri" w:hAnsi="Calibri"/>
+          <w:sz w:val="21"/>
+          <w:szCs w:val="21"/>
+        </w:rPr>
+        <w:t xml:space="preserve">in Test 1, the Construct Capital draft opened with "your investment in Nauta", an old portfolio company taken from Vikram’s notes rather than a signal from the last 30 days. The prompt now requires the first sentence to name one of the VC’s recent signals; a code check verifies it and regenerates the draft once if not; and drafts now receive the most on-topic signals first. In Test 2 the draft opened with BackOps’ $42M round, which the source confirms Construct co-led.</w:t>
+      </w:r>
+    </w:p>
+    <w:p>
+      <w:pPr>
+        <w:spacing w:after="120" w:before="0"/>
+      </w:pPr>
+      <w:r>
+        <w:rPr>
+          <w:rFonts w:ascii="Calibri" w:cs="Calibri" w:eastAsia="Calibri" w:hAnsi="Calibri"/>
+          <w:b/>
+          <w:bCs/>
+          <w:sz w:val="21"/>
+          <w:szCs w:val="21"/>
+        </w:rPr>
+        <w:t xml:space="preserve">Consistency between runs: </w:t>
+      </w:r>
+      <w:r>
+        <w:rPr>
+          <w:rFonts w:ascii="Calibri" w:cs="Calibri" w:eastAsia="Calibri" w:hAnsi="Calibri"/>
+          <w:sz w:val="21"/>
+          <w:szCs w:val="21"/>
+        </w:rPr>
+        <w:t xml:space="preserve">49 of 50 VCs received the same recommendation in both runs; the median score change was 0. The one change (Activant, 24 → 34) came from a new blog post found in the second run.</w:t>
+      </w:r>
+    </w:p>
+    <w:p>
+      <w:pPr>
+        <w:spacing w:after="120" w:before="0"/>
+      </w:pPr>
+      <w:r>
+        <w:rPr>
+          <w:rFonts w:ascii="Calibri" w:cs="Calibri" w:eastAsia="Calibri" w:hAnsi="Calibri"/>
+          <w:b/>
+          <w:bCs/>
+          <w:sz w:val="21"/>
+          <w:szCs w:val="21"/>
+        </w:rPr>
+        <w:t xml:space="preserve">Draft review: </w:t>
+      </w:r>
+      <w:r>
+        <w:rPr>
+          <w:rFonts w:ascii="Calibri" w:cs="Calibri" w:eastAsia="Calibri" w:hAnsi="Calibri"/>
+          <w:sz w:val="21"/>
+          <w:szCs w:val="21"/>
+        </w:rPr>
+        <w:t xml:space="preserve">all 8 drafts address the right partner, never mention another VC on the list, use the correct type (1 first email, 7 nudges), quote the real date of Vikram’s last contact in each nudge, and use only figures that appear in that VC’s evidence. 20 unit tests cover scoring, actions, validation, change detection and the draft-citation check.</w:t>
+      </w:r>
+    </w:p>
+    <w:p>
+      <w:pPr>
+        <w:spacing w:after="60" w:before="120"/>
+      </w:pPr>
+      <w:r>
+        <w:rPr>
+          <w:rFonts w:ascii="Calibri" w:cs="Calibri" w:eastAsia="Calibri" w:hAnsi="Calibri"/>
+          <w:b/>
+          <w:bCs/>
+          <w:sz w:val="21"/>
+          <w:szCs w:val="21"/>
+        </w:rPr>
+        <w:t xml:space="preserve">Sample draft (Construct Capital, first outreach):</w:t>
+      </w:r>
+    </w:p>
+    <w:p>
+      <w:pPr>
+        <w:pBdr>
+          <w:left w:val="single" w:color="C9D1DE" w:sz="12" w:space="10"/>
+        </w:pBdr>
+        <w:spacing w:after="60"/>
+        <w:ind w:left="400"/>
+      </w:pPr>
+      <w:r>
+        <w:rPr>
+          <w:rFonts w:ascii="Calibri" w:cs="Calibri" w:eastAsia="Calibri" w:hAnsi="Calibri"/>
+          <w:color w:val="33405A"/>
+          <w:sz w:val="19"/>
+          <w:szCs w:val="19"/>
+        </w:rPr>
+        <w:t xml:space="preserve">Hi Rachel,</w:t>
+      </w:r>
+    </w:p>
+    <w:p>
+      <w:pPr>
+        <w:pBdr>
+          <w:left w:val="single" w:color="C9D1DE" w:sz="12" w:space="10"/>
+        </w:pBdr>
+        <w:spacing w:after="60"/>
+        <w:ind w:left="400"/>
+      </w:pPr>
+      <w:r>
+        <w:rPr>
+          <w:rFonts w:ascii="Calibri" w:cs="Calibri" w:eastAsia="Calibri" w:hAnsi="Calibri"/>
+          <w:color w:val="33405A"/>
+          <w:sz w:val="19"/>
+          <w:szCs w:val="19"/>
+        </w:rPr>
+        <w:t xml:space="preserve">Saw that Construct Capital co-led BackOps’ $42M round to scale AI supply chain automation.</w:t>
+      </w:r>
+    </w:p>
+    <w:p>
+      <w:pPr>
+        <w:pBdr>
+          <w:left w:val="single" w:color="C9D1DE" w:sz="12" w:space="10"/>
+        </w:pBdr>
+        <w:spacing w:after="60"/>
+        <w:ind w:left="400"/>
+      </w:pPr>
+      <w:r>
+        <w:rPr>
+          <w:rFonts w:ascii="Calibri" w:cs="Calibri" w:eastAsia="Calibri" w:hAnsi="Calibri"/>
+          <w:color w:val="33405A"/>
+          <w:sz w:val="19"/>
+          <w:szCs w:val="19"/>
+        </w:rPr>
+        <w:t xml:space="preserve">Given your focus on supply chain technology, I thought you might be interested in FreightLoop. We build B2B logistics SaaS for Indian mid-market shippers, providing a single workspace to book carriers, track shipments, and reconcile freight invoices.</w:t>
+      </w:r>
+    </w:p>
+    <w:p>
+      <w:pPr>
+        <w:pBdr>
+          <w:left w:val="single" w:color="C9D1DE" w:sz="12" w:space="10"/>
+        </w:pBdr>
+        <w:spacing w:after="60"/>
+        <w:ind w:left="400"/>
+      </w:pPr>
+      <w:r>
+        <w:rPr>
+          <w:rFonts w:ascii="Calibri" w:cs="Calibri" w:eastAsia="Calibri" w:hAnsi="Calibri"/>
+          <w:color w:val="33405A"/>
+          <w:sz w:val="19"/>
+          <w:szCs w:val="19"/>
+        </w:rPr>
+        <w:t xml:space="preserve">We are currently raising our Seed round and I would love to connect. Are you open to a 20-minute call next week?</w:t>
+      </w:r>
+    </w:p>
+    <w:p>
+      <w:pPr>
+        <w:pBdr>
+          <w:left w:val="single" w:color="C9D1DE" w:sz="12" w:space="10"/>
+        </w:pBdr>
+        <w:spacing w:after="60"/>
+        <w:ind w:left="400"/>
+      </w:pPr>
+      <w:r>
+        <w:rPr>
+          <w:rFonts w:ascii="Calibri" w:cs="Calibri" w:eastAsia="Calibri" w:hAnsi="Calibri"/>
+          <w:color w:val="33405A"/>
+          <w:sz w:val="19"/>
+          <w:szCs w:val="19"/>
+        </w:rPr>
+        <w:t xml:space="preserve">Best, Vikram</w:t>
+      </w:r>
+    </w:p>
+    <w:p>
+      <w:pPr>
+        <w:pStyle w:val="Heading1"/>
+        <w:spacing w:after="120" w:before="280"/>
+      </w:pPr>
+      <w:r>
+        <w:rPr>
+          <w:rFonts w:ascii="Calibri" w:cs="Calibri" w:eastAsia="Calibri" w:hAnsi="Calibri"/>
+          <w:b/>
+          <w:bCs/>
+          <w:color w:val="13294B"/>
+          <w:sz w:val="30"/>
+          <w:szCs w:val="30"/>
+        </w:rPr>
+        <w:t xml:space="preserve">9. Assumptions and limitations</w:t>
       </w:r>
     </w:p>
     <w:p>

</xml_diff>